<commit_message>
Add abbreviations to project documentation
</commit_message>
<xml_diff>
--- a/Prova de Aptidão Profissional (PAP) - Leonardo Zelenski 12ºGPSI B.docx
+++ b/Prova de Aptidão Profissional (PAP) - Leonardo Zelenski 12ºGPSI B.docx
@@ -4063,6 +4063,714 @@
       <w:bookmarkEnd w:id="18"/>
       <w:bookmarkEnd w:id="19"/>
     </w:p>
+    <w:tbl>
+      <w:tblPr>
+        <w:tblStyle w:val="PlainTable1"/>
+        <w:tblW w:w="9639" w:type="dxa"/>
+        <w:tblInd w:w="-459" w:type="dxa"/>
+        <w:tblLook w:val="04A0" w:firstRow="1" w:lastRow="0" w:firstColumn="1" w:lastColumn="0" w:noHBand="0" w:noVBand="1"/>
+      </w:tblPr>
+      <w:tblGrid>
+        <w:gridCol w:w="1418"/>
+        <w:gridCol w:w="4394"/>
+        <w:gridCol w:w="3827"/>
+      </w:tblGrid>
+      <w:tr>
+        <w:trPr>
+          <w:cnfStyle w:val="100000000000" w:firstRow="1" w:lastRow="0" w:firstColumn="0" w:lastColumn="0" w:oddVBand="0" w:evenVBand="0" w:oddHBand="0" w:evenHBand="0" w:firstRowFirstColumn="0" w:firstRowLastColumn="0" w:lastRowFirstColumn="0" w:lastRowLastColumn="0"/>
+          <w:trHeight w:val="1077"/>
+        </w:trPr>
+        <w:tc>
+          <w:tcPr>
+            <w:cnfStyle w:val="001000000000" w:firstRow="0" w:lastRow="0" w:firstColumn="1" w:lastColumn="0" w:oddVBand="0" w:evenVBand="0" w:oddHBand="0" w:evenHBand="0" w:firstRowFirstColumn="0" w:firstRowLastColumn="0" w:lastRowFirstColumn="0" w:lastRowLastColumn="0"/>
+            <w:tcW w:w="1418" w:type="dxa"/>
+            <w:shd w:val="clear" w:color="auto" w:fill="B8CCE4" w:themeFill="accent1" w:themeFillTint="66"/>
+            <w:vAlign w:val="center"/>
+            <w:hideMark/>
+          </w:tcPr>
+          <w:p>
+            <w:pPr>
+              <w:jc w:val="center"/>
+              <w:rPr>
+                <w:b w:val="0"/>
+                <w:bCs w:val="0"/>
+                <w:lang w:val="en-GB"/>
+              </w:rPr>
+            </w:pPr>
+            <w:proofErr w:type="spellStart"/>
+            <w:r>
+              <w:rPr>
+                <w:lang w:val="en-GB"/>
+              </w:rPr>
+              <w:t>Abreviação</w:t>
+            </w:r>
+            <w:proofErr w:type="spellEnd"/>
+            <w:r>
+              <w:rPr>
+                <w:lang w:val="en-GB"/>
+              </w:rPr>
+              <w:t xml:space="preserve"> </w:t>
+            </w:r>
+          </w:p>
+        </w:tc>
+        <w:tc>
+          <w:tcPr>
+            <w:tcW w:w="4394" w:type="dxa"/>
+            <w:shd w:val="clear" w:color="auto" w:fill="B8CCE4" w:themeFill="accent1" w:themeFillTint="66"/>
+            <w:vAlign w:val="center"/>
+            <w:hideMark/>
+          </w:tcPr>
+          <w:p>
+            <w:pPr>
+              <w:jc w:val="center"/>
+              <w:cnfStyle w:val="100000000000" w:firstRow="1" w:lastRow="0" w:firstColumn="0" w:lastColumn="0" w:oddVBand="0" w:evenVBand="0" w:oddHBand="0" w:evenHBand="0" w:firstRowFirstColumn="0" w:firstRowLastColumn="0" w:lastRowFirstColumn="0" w:lastRowLastColumn="0"/>
+              <w:rPr>
+                <w:lang w:val="en-GB"/>
+              </w:rPr>
+            </w:pPr>
+            <w:proofErr w:type="spellStart"/>
+            <w:r>
+              <w:rPr>
+                <w:lang w:val="en-GB"/>
+              </w:rPr>
+              <w:t>Português</w:t>
+            </w:r>
+            <w:proofErr w:type="spellEnd"/>
+            <w:r>
+              <w:rPr>
+                <w:lang w:val="en-GB"/>
+              </w:rPr>
+              <w:t xml:space="preserve"> </w:t>
+            </w:r>
+          </w:p>
+        </w:tc>
+        <w:tc>
+          <w:tcPr>
+            <w:tcW w:w="3827" w:type="dxa"/>
+            <w:shd w:val="clear" w:color="auto" w:fill="B8CCE4" w:themeFill="accent1" w:themeFillTint="66"/>
+            <w:vAlign w:val="center"/>
+            <w:hideMark/>
+          </w:tcPr>
+          <w:p>
+            <w:pPr>
+              <w:jc w:val="center"/>
+              <w:cnfStyle w:val="100000000000" w:firstRow="1" w:lastRow="0" w:firstColumn="0" w:lastColumn="0" w:oddVBand="0" w:evenVBand="0" w:oddHBand="0" w:evenHBand="0" w:firstRowFirstColumn="0" w:firstRowLastColumn="0" w:lastRowFirstColumn="0" w:lastRowLastColumn="0"/>
+              <w:rPr>
+                <w:lang w:val="en-GB"/>
+              </w:rPr>
+            </w:pPr>
+            <w:proofErr w:type="spellStart"/>
+            <w:r>
+              <w:rPr>
+                <w:lang w:val="en-GB"/>
+              </w:rPr>
+              <w:t>Inglês</w:t>
+            </w:r>
+            <w:proofErr w:type="spellEnd"/>
+          </w:p>
+        </w:tc>
+      </w:tr>
+      <w:tr>
+        <w:trPr>
+          <w:cnfStyle w:val="000000100000" w:firstRow="0" w:lastRow="0" w:firstColumn="0" w:lastColumn="0" w:oddVBand="0" w:evenVBand="0" w:oddHBand="1" w:evenHBand="0" w:firstRowFirstColumn="0" w:firstRowLastColumn="0" w:lastRowFirstColumn="0" w:lastRowLastColumn="0"/>
+        </w:trPr>
+        <w:tc>
+          <w:tcPr>
+            <w:cnfStyle w:val="001000000000" w:firstRow="0" w:lastRow="0" w:firstColumn="1" w:lastColumn="0" w:oddVBand="0" w:evenVBand="0" w:oddHBand="0" w:evenHBand="0" w:firstRowFirstColumn="0" w:firstRowLastColumn="0" w:lastRowFirstColumn="0" w:lastRowLastColumn="0"/>
+            <w:tcW w:w="1418" w:type="dxa"/>
+            <w:vAlign w:val="center"/>
+          </w:tcPr>
+          <w:p>
+            <w:pPr>
+              <w:jc w:val="center"/>
+            </w:pPr>
+            <w:r>
+              <w:t>PAP</w:t>
+            </w:r>
+          </w:p>
+        </w:tc>
+        <w:tc>
+          <w:tcPr>
+            <w:tcW w:w="4394" w:type="dxa"/>
+            <w:vAlign w:val="center"/>
+          </w:tcPr>
+          <w:p>
+            <w:pPr>
+              <w:jc w:val="center"/>
+              <w:cnfStyle w:val="000000100000" w:firstRow="0" w:lastRow="0" w:firstColumn="0" w:lastColumn="0" w:oddVBand="0" w:evenVBand="0" w:oddHBand="1" w:evenHBand="0" w:firstRowFirstColumn="0" w:firstRowLastColumn="0" w:lastRowFirstColumn="0" w:lastRowLastColumn="0"/>
+            </w:pPr>
+            <w:r>
+              <w:t>Prova de Aptidão Profissional</w:t>
+            </w:r>
+          </w:p>
+        </w:tc>
+        <w:tc>
+          <w:tcPr>
+            <w:tcW w:w="3827" w:type="dxa"/>
+            <w:vAlign w:val="center"/>
+          </w:tcPr>
+          <w:p>
+            <w:pPr>
+              <w:jc w:val="center"/>
+              <w:cnfStyle w:val="000000100000" w:firstRow="0" w:lastRow="0" w:firstColumn="0" w:lastColumn="0" w:oddVBand="0" w:evenVBand="0" w:oddHBand="1" w:evenHBand="0" w:firstRowFirstColumn="0" w:firstRowLastColumn="0" w:lastRowFirstColumn="0" w:lastRowLastColumn="0"/>
+            </w:pPr>
+            <w:r>
+              <w:t>Professional Aptitude Project</w:t>
+            </w:r>
+          </w:p>
+        </w:tc>
+      </w:tr>
+      <w:tr>
+        <w:tc>
+          <w:tcPr>
+            <w:cnfStyle w:val="001000000000" w:firstRow="0" w:lastRow="0" w:firstColumn="1" w:lastColumn="0" w:oddVBand="0" w:evenVBand="0" w:oddHBand="0" w:evenHBand="0" w:firstRowFirstColumn="0" w:firstRowLastColumn="0" w:lastRowFirstColumn="0" w:lastRowLastColumn="0"/>
+            <w:tcW w:w="1418" w:type="dxa"/>
+            <w:vAlign w:val="center"/>
+            <w:hideMark/>
+          </w:tcPr>
+          <w:p>
+            <w:pPr>
+              <w:jc w:val="center"/>
+            </w:pPr>
+            <w:r>
+              <w:t>ESC</w:t>
+            </w:r>
+          </w:p>
+        </w:tc>
+        <w:tc>
+          <w:tcPr>
+            <w:tcW w:w="4394" w:type="dxa"/>
+            <w:vAlign w:val="center"/>
+            <w:hideMark/>
+          </w:tcPr>
+          <w:p>
+            <w:pPr>
+              <w:jc w:val="center"/>
+              <w:cnfStyle w:val="000000000000" w:firstRow="0" w:lastRow="0" w:firstColumn="0" w:lastColumn="0" w:oddVBand="0" w:evenVBand="0" w:oddHBand="0" w:evenHBand="0" w:firstRowFirstColumn="0" w:firstRowLastColumn="0" w:lastRowFirstColumn="0" w:lastRowLastColumn="0"/>
+              <w:rPr>
+                <w:lang w:val="en-GB"/>
+              </w:rPr>
+            </w:pPr>
+            <w:r>
+              <w:t>C</w:t>
+            </w:r>
+            <w:r>
+              <w:t xml:space="preserve">ontrolo </w:t>
+            </w:r>
+            <w:proofErr w:type="spellStart"/>
+            <w:r>
+              <w:t>E</w:t>
+            </w:r>
+            <w:r>
+              <w:t>lectrónico</w:t>
+            </w:r>
+            <w:proofErr w:type="spellEnd"/>
+            <w:r>
+              <w:t xml:space="preserve"> de </w:t>
+            </w:r>
+            <w:r>
+              <w:t>V</w:t>
+            </w:r>
+            <w:r>
+              <w:t>elocidade</w:t>
+            </w:r>
+          </w:p>
+        </w:tc>
+        <w:tc>
+          <w:tcPr>
+            <w:tcW w:w="3827" w:type="dxa"/>
+            <w:vAlign w:val="center"/>
+            <w:hideMark/>
+          </w:tcPr>
+          <w:p>
+            <w:pPr>
+              <w:jc w:val="center"/>
+              <w:cnfStyle w:val="000000000000" w:firstRow="0" w:lastRow="0" w:firstColumn="0" w:lastColumn="0" w:oddVBand="0" w:evenVBand="0" w:oddHBand="0" w:evenHBand="0" w:firstRowFirstColumn="0" w:firstRowLastColumn="0" w:lastRowFirstColumn="0" w:lastRowLastColumn="0"/>
+              <w:rPr>
+                <w:lang w:val="en-GB"/>
+              </w:rPr>
+            </w:pPr>
+            <w:proofErr w:type="spellStart"/>
+            <w:r>
+              <w:t>Electronic</w:t>
+            </w:r>
+            <w:proofErr w:type="spellEnd"/>
+            <w:r>
+              <w:t xml:space="preserve"> Speed </w:t>
+            </w:r>
+            <w:proofErr w:type="spellStart"/>
+            <w:r>
+              <w:t>Controller</w:t>
+            </w:r>
+            <w:proofErr w:type="spellEnd"/>
+          </w:p>
+        </w:tc>
+      </w:tr>
+      <w:tr>
+        <w:trPr>
+          <w:cnfStyle w:val="000000100000" w:firstRow="0" w:lastRow="0" w:firstColumn="0" w:lastColumn="0" w:oddVBand="0" w:evenVBand="0" w:oddHBand="1" w:evenHBand="0" w:firstRowFirstColumn="0" w:firstRowLastColumn="0" w:lastRowFirstColumn="0" w:lastRowLastColumn="0"/>
+        </w:trPr>
+        <w:tc>
+          <w:tcPr>
+            <w:cnfStyle w:val="001000000000" w:firstRow="0" w:lastRow="0" w:firstColumn="1" w:lastColumn="0" w:oddVBand="0" w:evenVBand="0" w:oddHBand="0" w:evenHBand="0" w:firstRowFirstColumn="0" w:firstRowLastColumn="0" w:lastRowFirstColumn="0" w:lastRowLastColumn="0"/>
+            <w:tcW w:w="1418" w:type="dxa"/>
+            <w:vAlign w:val="center"/>
+          </w:tcPr>
+          <w:p>
+            <w:pPr>
+              <w:jc w:val="center"/>
+              <w:rPr>
+                <w:lang w:val="en-GB"/>
+              </w:rPr>
+            </w:pPr>
+            <w:r>
+              <w:rPr>
+                <w:lang w:val="en-GB"/>
+              </w:rPr>
+              <w:t>VANT</w:t>
+            </w:r>
+          </w:p>
+        </w:tc>
+        <w:tc>
+          <w:tcPr>
+            <w:tcW w:w="4394" w:type="dxa"/>
+            <w:vAlign w:val="center"/>
+          </w:tcPr>
+          <w:p>
+            <w:pPr>
+              <w:jc w:val="center"/>
+              <w:cnfStyle w:val="000000100000" w:firstRow="0" w:lastRow="0" w:firstColumn="0" w:lastColumn="0" w:oddVBand="0" w:evenVBand="0" w:oddHBand="1" w:evenHBand="0" w:firstRowFirstColumn="0" w:firstRowLastColumn="0" w:lastRowFirstColumn="0" w:lastRowLastColumn="0"/>
+            </w:pPr>
+            <w:r>
+              <w:t>V</w:t>
+            </w:r>
+            <w:r>
+              <w:t xml:space="preserve">eículos </w:t>
+            </w:r>
+            <w:r>
+              <w:t>A</w:t>
+            </w:r>
+            <w:r>
+              <w:t xml:space="preserve">éreos não </w:t>
+            </w:r>
+            <w:r>
+              <w:t>T</w:t>
+            </w:r>
+            <w:r>
+              <w:t>ripulados</w:t>
+            </w:r>
+          </w:p>
+        </w:tc>
+        <w:tc>
+          <w:tcPr>
+            <w:tcW w:w="3827" w:type="dxa"/>
+            <w:vAlign w:val="center"/>
+          </w:tcPr>
+          <w:p>
+            <w:pPr>
+              <w:jc w:val="center"/>
+              <w:cnfStyle w:val="000000100000" w:firstRow="0" w:lastRow="0" w:firstColumn="0" w:lastColumn="0" w:oddVBand="0" w:evenVBand="0" w:oddHBand="1" w:evenHBand="0" w:firstRowFirstColumn="0" w:firstRowLastColumn="0" w:lastRowFirstColumn="0" w:lastRowLastColumn="0"/>
+            </w:pPr>
+            <w:proofErr w:type="spellStart"/>
+            <w:r>
+              <w:t>Unmanned</w:t>
+            </w:r>
+            <w:proofErr w:type="spellEnd"/>
+            <w:r>
+              <w:t xml:space="preserve"> </w:t>
+            </w:r>
+            <w:proofErr w:type="spellStart"/>
+            <w:r>
+              <w:t>Aerial</w:t>
+            </w:r>
+            <w:proofErr w:type="spellEnd"/>
+            <w:r>
+              <w:t xml:space="preserve"> </w:t>
+            </w:r>
+            <w:proofErr w:type="spellStart"/>
+            <w:r>
+              <w:t>Vehicle</w:t>
+            </w:r>
+            <w:proofErr w:type="spellEnd"/>
+          </w:p>
+        </w:tc>
+      </w:tr>
+      <w:tr>
+        <w:tc>
+          <w:tcPr>
+            <w:cnfStyle w:val="001000000000" w:firstRow="0" w:lastRow="0" w:firstColumn="1" w:lastColumn="0" w:oddVBand="0" w:evenVBand="0" w:oddHBand="0" w:evenHBand="0" w:firstRowFirstColumn="0" w:firstRowLastColumn="0" w:lastRowFirstColumn="0" w:lastRowLastColumn="0"/>
+            <w:tcW w:w="1418" w:type="dxa"/>
+            <w:vAlign w:val="center"/>
+          </w:tcPr>
+          <w:p>
+            <w:pPr>
+              <w:jc w:val="center"/>
+              <w:rPr>
+                <w:lang w:val="en-GB"/>
+              </w:rPr>
+            </w:pPr>
+            <w:r>
+              <w:t>I</w:t>
+            </w:r>
+            <w:r>
+              <w:t>DE</w:t>
+            </w:r>
+          </w:p>
+        </w:tc>
+        <w:tc>
+          <w:tcPr>
+            <w:tcW w:w="4394" w:type="dxa"/>
+            <w:vAlign w:val="center"/>
+          </w:tcPr>
+          <w:p>
+            <w:pPr>
+              <w:jc w:val="center"/>
+              <w:cnfStyle w:val="000000000000" w:firstRow="0" w:lastRow="0" w:firstColumn="0" w:lastColumn="0" w:oddVBand="0" w:evenVBand="0" w:oddHBand="0" w:evenHBand="0" w:firstRowFirstColumn="0" w:firstRowLastColumn="0" w:lastRowFirstColumn="0" w:lastRowLastColumn="0"/>
+            </w:pPr>
+            <w:r>
+              <w:t>A</w:t>
+            </w:r>
+            <w:r>
+              <w:t xml:space="preserve">mbiente de </w:t>
+            </w:r>
+            <w:r>
+              <w:t>D</w:t>
+            </w:r>
+            <w:r>
+              <w:t>esenvolvimento</w:t>
+            </w:r>
+            <w:r>
+              <w:t xml:space="preserve"> Integrado</w:t>
+            </w:r>
+          </w:p>
+        </w:tc>
+        <w:tc>
+          <w:tcPr>
+            <w:tcW w:w="3827" w:type="dxa"/>
+            <w:vAlign w:val="center"/>
+          </w:tcPr>
+          <w:p>
+            <w:pPr>
+              <w:jc w:val="center"/>
+              <w:cnfStyle w:val="000000000000" w:firstRow="0" w:lastRow="0" w:firstColumn="0" w:lastColumn="0" w:oddVBand="0" w:evenVBand="0" w:oddHBand="0" w:evenHBand="0" w:firstRowFirstColumn="0" w:firstRowLastColumn="0" w:lastRowFirstColumn="0" w:lastRowLastColumn="0"/>
+            </w:pPr>
+            <w:proofErr w:type="spellStart"/>
+            <w:r>
+              <w:t>Integrated</w:t>
+            </w:r>
+            <w:proofErr w:type="spellEnd"/>
+            <w:r>
+              <w:t xml:space="preserve"> </w:t>
+            </w:r>
+            <w:proofErr w:type="spellStart"/>
+            <w:r>
+              <w:t>Development</w:t>
+            </w:r>
+            <w:proofErr w:type="spellEnd"/>
+            <w:r>
+              <w:t xml:space="preserve"> </w:t>
+            </w:r>
+            <w:proofErr w:type="spellStart"/>
+            <w:r>
+              <w:t>Environment</w:t>
+            </w:r>
+            <w:proofErr w:type="spellEnd"/>
+          </w:p>
+        </w:tc>
+      </w:tr>
+      <w:tr>
+        <w:trPr>
+          <w:cnfStyle w:val="000000100000" w:firstRow="0" w:lastRow="0" w:firstColumn="0" w:lastColumn="0" w:oddVBand="0" w:evenVBand="0" w:oddHBand="1" w:evenHBand="0" w:firstRowFirstColumn="0" w:firstRowLastColumn="0" w:lastRowFirstColumn="0" w:lastRowLastColumn="0"/>
+        </w:trPr>
+        <w:tc>
+          <w:tcPr>
+            <w:cnfStyle w:val="001000000000" w:firstRow="0" w:lastRow="0" w:firstColumn="1" w:lastColumn="0" w:oddVBand="0" w:evenVBand="0" w:oddHBand="0" w:evenHBand="0" w:firstRowFirstColumn="0" w:firstRowLastColumn="0" w:lastRowFirstColumn="0" w:lastRowLastColumn="0"/>
+            <w:tcW w:w="1418" w:type="dxa"/>
+            <w:vAlign w:val="center"/>
+          </w:tcPr>
+          <w:p>
+            <w:pPr>
+              <w:jc w:val="center"/>
+              <w:rPr>
+                <w:lang w:val="en-GB"/>
+              </w:rPr>
+            </w:pPr>
+            <w:r>
+              <w:t>PWM</w:t>
+            </w:r>
+          </w:p>
+        </w:tc>
+        <w:tc>
+          <w:tcPr>
+            <w:tcW w:w="4394" w:type="dxa"/>
+            <w:vAlign w:val="center"/>
+          </w:tcPr>
+          <w:p>
+            <w:pPr>
+              <w:jc w:val="center"/>
+              <w:cnfStyle w:val="000000100000" w:firstRow="0" w:lastRow="0" w:firstColumn="0" w:lastColumn="0" w:oddVBand="0" w:evenVBand="0" w:oddHBand="1" w:evenHBand="0" w:firstRowFirstColumn="0" w:firstRowLastColumn="0" w:lastRowFirstColumn="0" w:lastRowLastColumn="0"/>
+            </w:pPr>
+            <w:r>
+              <w:t>Modulação por Largura de Pulso</w:t>
+            </w:r>
+          </w:p>
+        </w:tc>
+        <w:tc>
+          <w:tcPr>
+            <w:tcW w:w="3827" w:type="dxa"/>
+            <w:vAlign w:val="center"/>
+          </w:tcPr>
+          <w:p>
+            <w:pPr>
+              <w:jc w:val="center"/>
+              <w:cnfStyle w:val="000000100000" w:firstRow="0" w:lastRow="0" w:firstColumn="0" w:lastColumn="0" w:oddVBand="0" w:evenVBand="0" w:oddHBand="1" w:evenHBand="0" w:firstRowFirstColumn="0" w:firstRowLastColumn="0" w:lastRowFirstColumn="0" w:lastRowLastColumn="0"/>
+            </w:pPr>
+            <w:r>
+              <w:t xml:space="preserve">Pulse </w:t>
+            </w:r>
+            <w:proofErr w:type="spellStart"/>
+            <w:r>
+              <w:t>Width</w:t>
+            </w:r>
+            <w:proofErr w:type="spellEnd"/>
+            <w:r>
+              <w:t xml:space="preserve"> </w:t>
+            </w:r>
+            <w:proofErr w:type="spellStart"/>
+            <w:r>
+              <w:t>Modulation</w:t>
+            </w:r>
+            <w:proofErr w:type="spellEnd"/>
+          </w:p>
+        </w:tc>
+      </w:tr>
+      <w:tr>
+        <w:tc>
+          <w:tcPr>
+            <w:cnfStyle w:val="001000000000" w:firstRow="0" w:lastRow="0" w:firstColumn="1" w:lastColumn="0" w:oddVBand="0" w:evenVBand="0" w:oddHBand="0" w:evenHBand="0" w:firstRowFirstColumn="0" w:firstRowLastColumn="0" w:lastRowFirstColumn="0" w:lastRowLastColumn="0"/>
+            <w:tcW w:w="1418" w:type="dxa"/>
+            <w:vAlign w:val="center"/>
+          </w:tcPr>
+          <w:p>
+            <w:pPr>
+              <w:jc w:val="center"/>
+            </w:pPr>
+            <w:r>
+              <w:t>UART</w:t>
+            </w:r>
+          </w:p>
+        </w:tc>
+        <w:tc>
+          <w:tcPr>
+            <w:tcW w:w="4394" w:type="dxa"/>
+            <w:vAlign w:val="center"/>
+          </w:tcPr>
+          <w:p>
+            <w:pPr>
+              <w:jc w:val="center"/>
+              <w:cnfStyle w:val="000000000000" w:firstRow="0" w:lastRow="0" w:firstColumn="0" w:lastColumn="0" w:oddVBand="0" w:evenVBand="0" w:oddHBand="0" w:evenHBand="0" w:firstRowFirstColumn="0" w:firstRowLastColumn="0" w:lastRowFirstColumn="0" w:lastRowLastColumn="0"/>
+            </w:pPr>
+            <w:proofErr w:type="spellStart"/>
+            <w:r>
+              <w:t>Receptor</w:t>
+            </w:r>
+            <w:proofErr w:type="spellEnd"/>
+            <w:r>
+              <w:t>-Transmissor Assíncrono Universal</w:t>
+            </w:r>
+          </w:p>
+        </w:tc>
+        <w:tc>
+          <w:tcPr>
+            <w:tcW w:w="3827" w:type="dxa"/>
+            <w:vAlign w:val="center"/>
+          </w:tcPr>
+          <w:p>
+            <w:pPr>
+              <w:jc w:val="center"/>
+              <w:cnfStyle w:val="000000000000" w:firstRow="0" w:lastRow="0" w:firstColumn="0" w:lastColumn="0" w:oddVBand="0" w:evenVBand="0" w:oddHBand="0" w:evenHBand="0" w:firstRowFirstColumn="0" w:firstRowLastColumn="0" w:lastRowFirstColumn="0" w:lastRowLastColumn="0"/>
+            </w:pPr>
+            <w:r>
+              <w:t xml:space="preserve">Universal </w:t>
+            </w:r>
+            <w:proofErr w:type="spellStart"/>
+            <w:r>
+              <w:t>Asynchronous</w:t>
+            </w:r>
+            <w:proofErr w:type="spellEnd"/>
+            <w:r>
+              <w:t xml:space="preserve"> </w:t>
+            </w:r>
+            <w:proofErr w:type="spellStart"/>
+            <w:r>
+              <w:t>Receiver-Transmitter</w:t>
+            </w:r>
+            <w:proofErr w:type="spellEnd"/>
+          </w:p>
+        </w:tc>
+      </w:tr>
+      <w:tr>
+        <w:trPr>
+          <w:cnfStyle w:val="000000100000" w:firstRow="0" w:lastRow="0" w:firstColumn="0" w:lastColumn="0" w:oddVBand="0" w:evenVBand="0" w:oddHBand="1" w:evenHBand="0" w:firstRowFirstColumn="0" w:firstRowLastColumn="0" w:lastRowFirstColumn="0" w:lastRowLastColumn="0"/>
+        </w:trPr>
+        <w:tc>
+          <w:tcPr>
+            <w:cnfStyle w:val="001000000000" w:firstRow="0" w:lastRow="0" w:firstColumn="1" w:lastColumn="0" w:oddVBand="0" w:evenVBand="0" w:oddHBand="0" w:evenHBand="0" w:firstRowFirstColumn="0" w:firstRowLastColumn="0" w:lastRowFirstColumn="0" w:lastRowLastColumn="0"/>
+            <w:tcW w:w="1418" w:type="dxa"/>
+            <w:vAlign w:val="center"/>
+          </w:tcPr>
+          <w:p>
+            <w:pPr>
+              <w:jc w:val="center"/>
+            </w:pPr>
+            <w:r>
+              <w:t>KV</w:t>
+            </w:r>
+          </w:p>
+        </w:tc>
+        <w:tc>
+          <w:tcPr>
+            <w:tcW w:w="4394" w:type="dxa"/>
+            <w:vAlign w:val="center"/>
+          </w:tcPr>
+          <w:p>
+            <w:pPr>
+              <w:jc w:val="center"/>
+              <w:cnfStyle w:val="000000100000" w:firstRow="0" w:lastRow="0" w:firstColumn="0" w:lastColumn="0" w:oddVBand="0" w:evenVBand="0" w:oddHBand="1" w:evenHBand="0" w:firstRowFirstColumn="0" w:firstRowLastColumn="0" w:lastRowFirstColumn="0" w:lastRowLastColumn="0"/>
+              <w:rPr>
+                <w:lang w:val="en-GB"/>
+              </w:rPr>
+            </w:pPr>
+            <w:r>
+              <w:t>quilovolts por revolução</w:t>
+            </w:r>
+          </w:p>
+        </w:tc>
+        <w:tc>
+          <w:tcPr>
+            <w:tcW w:w="3827" w:type="dxa"/>
+            <w:vAlign w:val="center"/>
+          </w:tcPr>
+          <w:p>
+            <w:pPr>
+              <w:jc w:val="center"/>
+              <w:cnfStyle w:val="000000100000" w:firstRow="0" w:lastRow="0" w:firstColumn="0" w:lastColumn="0" w:oddVBand="0" w:evenVBand="0" w:oddHBand="1" w:evenHBand="0" w:firstRowFirstColumn="0" w:firstRowLastColumn="0" w:lastRowFirstColumn="0" w:lastRowLastColumn="0"/>
+            </w:pPr>
+            <w:r>
+              <w:t xml:space="preserve">kilovolts per </w:t>
+            </w:r>
+            <w:proofErr w:type="spellStart"/>
+            <w:r>
+              <w:t>revolution</w:t>
+            </w:r>
+            <w:proofErr w:type="spellEnd"/>
+          </w:p>
+        </w:tc>
+      </w:tr>
+      <w:tr>
+        <w:tc>
+          <w:tcPr>
+            <w:cnfStyle w:val="001000000000" w:firstRow="0" w:lastRow="0" w:firstColumn="1" w:lastColumn="0" w:oddVBand="0" w:evenVBand="0" w:oddHBand="0" w:evenHBand="0" w:firstRowFirstColumn="0" w:firstRowLastColumn="0" w:lastRowFirstColumn="0" w:lastRowLastColumn="0"/>
+            <w:tcW w:w="1418" w:type="dxa"/>
+            <w:vAlign w:val="center"/>
+          </w:tcPr>
+          <w:p>
+            <w:pPr>
+              <w:jc w:val="center"/>
+            </w:pPr>
+            <w:r>
+              <w:t>MM</w:t>
+            </w:r>
+          </w:p>
+        </w:tc>
+        <w:tc>
+          <w:tcPr>
+            <w:tcW w:w="4394" w:type="dxa"/>
+            <w:vAlign w:val="center"/>
+          </w:tcPr>
+          <w:p>
+            <w:pPr>
+              <w:jc w:val="center"/>
+              <w:cnfStyle w:val="000000000000" w:firstRow="0" w:lastRow="0" w:firstColumn="0" w:lastColumn="0" w:oddVBand="0" w:evenVBand="0" w:oddHBand="0" w:evenHBand="0" w:firstRowFirstColumn="0" w:firstRowLastColumn="0" w:lastRowFirstColumn="0" w:lastRowLastColumn="0"/>
+            </w:pPr>
+            <w:r>
+              <w:t>Macho-Macho</w:t>
+            </w:r>
+          </w:p>
+        </w:tc>
+        <w:tc>
+          <w:tcPr>
+            <w:tcW w:w="3827" w:type="dxa"/>
+            <w:vAlign w:val="center"/>
+          </w:tcPr>
+          <w:p>
+            <w:pPr>
+              <w:jc w:val="center"/>
+              <w:cnfStyle w:val="000000000000" w:firstRow="0" w:lastRow="0" w:firstColumn="0" w:lastColumn="0" w:oddVBand="0" w:evenVBand="0" w:oddHBand="0" w:evenHBand="0" w:firstRowFirstColumn="0" w:firstRowLastColumn="0" w:lastRowFirstColumn="0" w:lastRowLastColumn="0"/>
+            </w:pPr>
+            <w:r>
+              <w:t>male-male</w:t>
+            </w:r>
+          </w:p>
+        </w:tc>
+      </w:tr>
+      <w:tr>
+        <w:trPr>
+          <w:cnfStyle w:val="000000100000" w:firstRow="0" w:lastRow="0" w:firstColumn="0" w:lastColumn="0" w:oddVBand="0" w:evenVBand="0" w:oddHBand="1" w:evenHBand="0" w:firstRowFirstColumn="0" w:firstRowLastColumn="0" w:lastRowFirstColumn="0" w:lastRowLastColumn="0"/>
+        </w:trPr>
+        <w:tc>
+          <w:tcPr>
+            <w:cnfStyle w:val="001000000000" w:firstRow="0" w:lastRow="0" w:firstColumn="1" w:lastColumn="0" w:oddVBand="0" w:evenVBand="0" w:oddHBand="0" w:evenHBand="0" w:firstRowFirstColumn="0" w:firstRowLastColumn="0" w:lastRowFirstColumn="0" w:lastRowLastColumn="0"/>
+            <w:tcW w:w="1418" w:type="dxa"/>
+            <w:vAlign w:val="center"/>
+          </w:tcPr>
+          <w:p>
+            <w:pPr>
+              <w:jc w:val="center"/>
+            </w:pPr>
+            <w:r>
+              <w:t>MF</w:t>
+            </w:r>
+          </w:p>
+        </w:tc>
+        <w:tc>
+          <w:tcPr>
+            <w:tcW w:w="4394" w:type="dxa"/>
+            <w:vAlign w:val="center"/>
+          </w:tcPr>
+          <w:p>
+            <w:pPr>
+              <w:jc w:val="center"/>
+              <w:cnfStyle w:val="000000100000" w:firstRow="0" w:lastRow="0" w:firstColumn="0" w:lastColumn="0" w:oddVBand="0" w:evenVBand="0" w:oddHBand="1" w:evenHBand="0" w:firstRowFirstColumn="0" w:firstRowLastColumn="0" w:lastRowFirstColumn="0" w:lastRowLastColumn="0"/>
+            </w:pPr>
+            <w:r>
+              <w:t>Macho-Fêmea</w:t>
+            </w:r>
+          </w:p>
+        </w:tc>
+        <w:tc>
+          <w:tcPr>
+            <w:tcW w:w="3827" w:type="dxa"/>
+            <w:vAlign w:val="center"/>
+          </w:tcPr>
+          <w:p>
+            <w:pPr>
+              <w:jc w:val="center"/>
+              <w:cnfStyle w:val="000000100000" w:firstRow="0" w:lastRow="0" w:firstColumn="0" w:lastColumn="0" w:oddVBand="0" w:evenVBand="0" w:oddHBand="1" w:evenHBand="0" w:firstRowFirstColumn="0" w:firstRowLastColumn="0" w:lastRowFirstColumn="0" w:lastRowLastColumn="0"/>
+            </w:pPr>
+            <w:r>
+              <w:t>male-</w:t>
+            </w:r>
+            <w:proofErr w:type="spellStart"/>
+            <w:r>
+              <w:t>female</w:t>
+            </w:r>
+            <w:proofErr w:type="spellEnd"/>
+          </w:p>
+        </w:tc>
+      </w:tr>
+    </w:tbl>
+    <w:p/>
     <w:p>
       <w:pPr>
         <w:rPr>
@@ -4216,15 +4924,7 @@
         <w:t>criar</w:t>
       </w:r>
       <w:r>
-        <w:t xml:space="preserve"> veículos aéreos não tripulados (</w:t>
-      </w:r>
-      <w:proofErr w:type="spellStart"/>
-      <w:r>
-        <w:t>VANTs</w:t>
-      </w:r>
-      <w:proofErr w:type="spellEnd"/>
-      <w:r>
-        <w:t>) através de uma arquitetura modular e de código aberto</w:t>
+        <w:t xml:space="preserve"> veículos aéreos não tripulados (VANT) através de uma arquitetura modular e de código aberto</w:t>
       </w:r>
       <w:r>
         <w:t xml:space="preserve"> focando na </w:t>
@@ -9377,7 +10077,7 @@
           <w:noProof/>
         </w:rPr>
         <w:drawing>
-          <wp:inline distT="0" distB="0" distL="0" distR="0" wp14:anchorId="5028E2AF" wp14:editId="45CC74B4">
+          <wp:inline distT="0" distB="0" distL="0" distR="0" wp14:anchorId="5028E2AF" wp14:editId="5D2EBC89">
             <wp:extent cx="3378835" cy="1213485"/>
             <wp:effectExtent l="19050" t="19050" r="0" b="5715"/>
             <wp:docPr id="471537322" name="Picture 3"/>
@@ -17228,7 +17928,7 @@
     <w:name w:val="Normal"/>
     <w:aliases w:val="RFCT Corpo Texto"/>
     <w:qFormat/>
-    <w:rsid w:val="00353C4C"/>
+    <w:rsid w:val="000A200F"/>
     <w:pPr>
       <w:spacing w:after="0" w:line="360" w:lineRule="auto"/>
       <w:jc w:val="both"/>

</xml_diff>

<commit_message>
Add core version file, update project documentation, and implement all 4 motor control test
</commit_message>
<xml_diff>
--- a/Prova de Aptidão Profissional (PAP) - Leonardo Zelenski 12ºGPSI B.docx
+++ b/Prova de Aptidão Profissional (PAP) - Leonardo Zelenski 12ºGPSI B.docx
@@ -5880,6 +5880,66 @@
           </w:p>
         </w:tc>
       </w:tr>
+      <w:tr>
+        <w:trPr>
+          <w:cnfStyle w:val="000000100000" w:firstRow="0" w:lastRow="0" w:firstColumn="0" w:lastColumn="0" w:oddVBand="0" w:evenVBand="0" w:oddHBand="1" w:evenHBand="0" w:firstRowFirstColumn="0" w:firstRowLastColumn="0" w:lastRowFirstColumn="0" w:lastRowLastColumn="0"/>
+        </w:trPr>
+        <w:tc>
+          <w:tcPr>
+            <w:cnfStyle w:val="001000000000" w:firstRow="0" w:lastRow="0" w:firstColumn="1" w:lastColumn="0" w:oddVBand="0" w:evenVBand="0" w:oddHBand="0" w:evenHBand="0" w:firstRowFirstColumn="0" w:firstRowLastColumn="0" w:lastRowFirstColumn="0" w:lastRowLastColumn="0"/>
+            <w:tcW w:w="1418" w:type="dxa"/>
+            <w:vAlign w:val="center"/>
+          </w:tcPr>
+          <w:p>
+            <w:pPr>
+              <w:jc w:val="center"/>
+            </w:pPr>
+            <w:r>
+              <w:rPr>
+                <w:rFonts w:cs="Arial"/>
+              </w:rPr>
+              <w:t>µ</w:t>
+            </w:r>
+            <w:r>
+              <w:t>s</w:t>
+            </w:r>
+          </w:p>
+        </w:tc>
+        <w:tc>
+          <w:tcPr>
+            <w:tcW w:w="4394" w:type="dxa"/>
+            <w:vAlign w:val="center"/>
+          </w:tcPr>
+          <w:p>
+            <w:pPr>
+              <w:jc w:val="center"/>
+              <w:cnfStyle w:val="000000100000" w:firstRow="0" w:lastRow="0" w:firstColumn="0" w:lastColumn="0" w:oddVBand="0" w:evenVBand="0" w:oddHBand="1" w:evenHBand="0" w:firstRowFirstColumn="0" w:firstRowLastColumn="0" w:lastRowFirstColumn="0" w:lastRowLastColumn="0"/>
+            </w:pPr>
+            <w:proofErr w:type="spellStart"/>
+            <w:r>
+              <w:t>Microsegundos</w:t>
+            </w:r>
+            <w:proofErr w:type="spellEnd"/>
+          </w:p>
+        </w:tc>
+        <w:tc>
+          <w:tcPr>
+            <w:tcW w:w="3827" w:type="dxa"/>
+            <w:vAlign w:val="center"/>
+          </w:tcPr>
+          <w:p>
+            <w:pPr>
+              <w:jc w:val="center"/>
+              <w:cnfStyle w:val="000000100000" w:firstRow="0" w:lastRow="0" w:firstColumn="0" w:lastColumn="0" w:oddVBand="0" w:evenVBand="0" w:oddHBand="1" w:evenHBand="0" w:firstRowFirstColumn="0" w:firstRowLastColumn="0" w:lastRowFirstColumn="0" w:lastRowLastColumn="0"/>
+            </w:pPr>
+            <w:proofErr w:type="spellStart"/>
+            <w:r>
+              <w:t>microseconds</w:t>
+            </w:r>
+            <w:proofErr w:type="spellEnd"/>
+          </w:p>
+        </w:tc>
+      </w:tr>
     </w:tbl>
     <w:p/>
     <w:p>
@@ -6276,8 +6336,8 @@
       </w:pPr>
       <w:bookmarkStart w:id="36" w:name="_Toc193126121"/>
       <w:bookmarkStart w:id="37" w:name="_Toc229269554"/>
-      <w:bookmarkStart w:id="38" w:name="_Hlk127266004"/>
-      <w:bookmarkStart w:id="39" w:name="_Toc229952466"/>
+      <w:bookmarkStart w:id="38" w:name="_Toc229952466"/>
+      <w:bookmarkStart w:id="39" w:name="_Hlk127266004"/>
       <w:r>
         <w:lastRenderedPageBreak/>
         <w:t xml:space="preserve">Capítulo II – </w:t>
@@ -6287,7 +6347,7 @@
       <w:r>
         <w:t>Desenvolvimento</w:t>
       </w:r>
-      <w:bookmarkEnd w:id="39"/>
+      <w:bookmarkEnd w:id="38"/>
     </w:p>
     <w:p>
       <w:pPr>
@@ -6296,7 +6356,7 @@
       <w:bookmarkStart w:id="40" w:name="_Toc193126122"/>
       <w:bookmarkStart w:id="41" w:name="_Toc193674306"/>
       <w:bookmarkStart w:id="42" w:name="_Toc229952467"/>
-      <w:bookmarkEnd w:id="38"/>
+      <w:bookmarkEnd w:id="39"/>
       <w:r>
         <w:t>2.1</w:t>
       </w:r>
@@ -7056,7 +7116,7 @@
                   <w:bCs w:val="0"/>
                   <w:lang w:val="en-GB"/>
                 </w:rPr>
-                <w:t>Electronic Speed Controller</w:t>
+                <w:t>ESC</w:t>
               </w:r>
             </w:hyperlink>
           </w:p>
@@ -7560,6 +7620,99 @@
             <w:cnfStyle w:val="001000000000" w:firstRow="0" w:lastRow="0" w:firstColumn="1" w:lastColumn="0" w:oddVBand="0" w:evenVBand="0" w:oddHBand="0" w:evenHBand="0" w:firstRowFirstColumn="0" w:firstRowLastColumn="0" w:lastRowFirstColumn="0" w:lastRowLastColumn="0"/>
             <w:tcW w:w="1843" w:type="dxa"/>
             <w:vAlign w:val="center"/>
+          </w:tcPr>
+          <w:p>
+            <w:pPr>
+              <w:jc w:val="center"/>
+              <w:rPr>
+                <w:b w:val="0"/>
+                <w:bCs w:val="0"/>
+              </w:rPr>
+            </w:pPr>
+            <w:hyperlink r:id="rId31" w:history="1">
+              <w:r>
+                <w:rPr>
+                  <w:rStyle w:val="Hyperlink"/>
+                  <w:b w:val="0"/>
+                  <w:bCs w:val="0"/>
+                </w:rPr>
+                <w:t>xt60 1 macho para 4 fêmea</w:t>
+              </w:r>
+            </w:hyperlink>
+          </w:p>
+        </w:tc>
+        <w:tc>
+          <w:tcPr>
+            <w:tcW w:w="2268" w:type="dxa"/>
+            <w:vAlign w:val="center"/>
+          </w:tcPr>
+          <w:p>
+            <w:pPr>
+              <w:jc w:val="center"/>
+              <w:cnfStyle w:val="000000100000" w:firstRow="0" w:lastRow="0" w:firstColumn="0" w:lastColumn="0" w:oddVBand="0" w:evenVBand="0" w:oddHBand="1" w:evenHBand="0" w:firstRowFirstColumn="0" w:firstRowLastColumn="0" w:lastRowFirstColumn="0" w:lastRowLastColumn="0"/>
+            </w:pPr>
+            <w:r>
+              <w:t>Design de Y de dupla extensão</w:t>
+            </w:r>
+          </w:p>
+        </w:tc>
+        <w:tc>
+          <w:tcPr>
+            <w:tcW w:w="1843" w:type="dxa"/>
+            <w:vAlign w:val="center"/>
+          </w:tcPr>
+          <w:p>
+            <w:pPr>
+              <w:jc w:val="center"/>
+              <w:cnfStyle w:val="000000100000" w:firstRow="0" w:lastRow="0" w:firstColumn="0" w:lastColumn="0" w:oddVBand="0" w:evenVBand="0" w:oddHBand="1" w:evenHBand="0" w:firstRowFirstColumn="0" w:firstRowLastColumn="0" w:lastRowFirstColumn="0" w:lastRowLastColumn="0"/>
+            </w:pPr>
+          </w:p>
+        </w:tc>
+        <w:tc>
+          <w:tcPr>
+            <w:tcW w:w="2410" w:type="dxa"/>
+            <w:vAlign w:val="center"/>
+          </w:tcPr>
+          <w:p>
+            <w:pPr>
+              <w:jc w:val="center"/>
+              <w:cnfStyle w:val="000000100000" w:firstRow="0" w:lastRow="0" w:firstColumn="0" w:lastColumn="0" w:oddVBand="0" w:evenVBand="0" w:oddHBand="1" w:evenHBand="0" w:firstRowFirstColumn="0" w:firstRowLastColumn="0" w:lastRowFirstColumn="0" w:lastRowLastColumn="0"/>
+            </w:pPr>
+            <w:r>
+              <w:t>Passar energia para os ESC</w:t>
+            </w:r>
+          </w:p>
+        </w:tc>
+        <w:tc>
+          <w:tcPr>
+            <w:tcW w:w="1275" w:type="dxa"/>
+            <w:vAlign w:val="center"/>
+          </w:tcPr>
+          <w:p>
+            <w:pPr>
+              <w:jc w:val="center"/>
+              <w:cnfStyle w:val="000000100000" w:firstRow="0" w:lastRow="0" w:firstColumn="0" w:lastColumn="0" w:oddVBand="0" w:evenVBand="0" w:oddHBand="1" w:evenHBand="0" w:firstRowFirstColumn="0" w:firstRowLastColumn="0" w:lastRowFirstColumn="0" w:lastRowLastColumn="0"/>
+              <w:rPr>
+                <w:b/>
+                <w:bCs/>
+              </w:rPr>
+            </w:pPr>
+            <w:r>
+              <w:rPr>
+                <w:b/>
+                <w:bCs/>
+              </w:rPr>
+              <w:t>4,77€</w:t>
+            </w:r>
+          </w:p>
+        </w:tc>
+      </w:tr>
+      <w:tr>
+        <w:tc>
+          <w:tcPr>
+            <w:cnfStyle w:val="001000000000" w:firstRow="0" w:lastRow="0" w:firstColumn="1" w:lastColumn="0" w:oddVBand="0" w:evenVBand="0" w:oddHBand="0" w:evenHBand="0" w:firstRowFirstColumn="0" w:firstRowLastColumn="0" w:lastRowFirstColumn="0" w:lastRowLastColumn="0"/>
+            <w:tcW w:w="1843" w:type="dxa"/>
+            <w:vAlign w:val="center"/>
             <w:hideMark/>
           </w:tcPr>
           <w:p>
@@ -7569,7 +7722,7 @@
                 <w:lang w:val="en-GB"/>
               </w:rPr>
             </w:pPr>
-            <w:hyperlink r:id="rId31" w:history="1">
+            <w:hyperlink r:id="rId32" w:history="1">
               <w:r>
                 <w:rPr>
                   <w:rStyle w:val="Hyperlink"/>
@@ -7591,7 +7744,7 @@
           <w:p>
             <w:pPr>
               <w:jc w:val="center"/>
-              <w:cnfStyle w:val="000000100000" w:firstRow="0" w:lastRow="0" w:firstColumn="0" w:lastColumn="0" w:oddVBand="0" w:evenVBand="0" w:oddHBand="1" w:evenHBand="0" w:firstRowFirstColumn="0" w:firstRowLastColumn="0" w:lastRowFirstColumn="0" w:lastRowLastColumn="0"/>
+              <w:cnfStyle w:val="000000000000" w:firstRow="0" w:lastRow="0" w:firstColumn="0" w:lastColumn="0" w:oddVBand="0" w:evenVBand="0" w:oddHBand="0" w:evenHBand="0" w:firstRowFirstColumn="0" w:firstRowLastColumn="0" w:lastRowFirstColumn="0" w:lastRowLastColumn="0"/>
               <w:rPr>
                 <w:lang w:val="en-GB"/>
               </w:rPr>
@@ -7643,7 +7796,7 @@
           <w:p>
             <w:pPr>
               <w:jc w:val="center"/>
-              <w:cnfStyle w:val="000000100000" w:firstRow="0" w:lastRow="0" w:firstColumn="0" w:lastColumn="0" w:oddVBand="0" w:evenVBand="0" w:oddHBand="1" w:evenHBand="0" w:firstRowFirstColumn="0" w:firstRowLastColumn="0" w:lastRowFirstColumn="0" w:lastRowLastColumn="0"/>
+              <w:cnfStyle w:val="000000000000" w:firstRow="0" w:lastRow="0" w:firstColumn="0" w:lastColumn="0" w:oddVBand="0" w:evenVBand="0" w:oddHBand="0" w:evenHBand="0" w:firstRowFirstColumn="0" w:firstRowLastColumn="0" w:lastRowFirstColumn="0" w:lastRowLastColumn="0"/>
               <w:rPr>
                 <w:lang w:val="en-GB"/>
               </w:rPr>
@@ -7665,7 +7818,7 @@
           <w:p>
             <w:pPr>
               <w:jc w:val="center"/>
-              <w:cnfStyle w:val="000000100000" w:firstRow="0" w:lastRow="0" w:firstColumn="0" w:lastColumn="0" w:oddVBand="0" w:evenVBand="0" w:oddHBand="1" w:evenHBand="0" w:firstRowFirstColumn="0" w:firstRowLastColumn="0" w:lastRowFirstColumn="0" w:lastRowLastColumn="0"/>
+              <w:cnfStyle w:val="000000000000" w:firstRow="0" w:lastRow="0" w:firstColumn="0" w:lastColumn="0" w:oddVBand="0" w:evenVBand="0" w:oddHBand="0" w:evenHBand="0" w:firstRowFirstColumn="0" w:firstRowLastColumn="0" w:lastRowFirstColumn="0" w:lastRowLastColumn="0"/>
             </w:pPr>
             <w:r>
               <w:t>Ampliação da distância de transmissão.</w:t>
@@ -7680,7 +7833,7 @@
           <w:p>
             <w:pPr>
               <w:jc w:val="center"/>
-              <w:cnfStyle w:val="000000100000" w:firstRow="0" w:lastRow="0" w:firstColumn="0" w:lastColumn="0" w:oddVBand="0" w:evenVBand="0" w:oddHBand="1" w:evenHBand="0" w:firstRowFirstColumn="0" w:firstRowLastColumn="0" w:lastRowFirstColumn="0" w:lastRowLastColumn="0"/>
+              <w:cnfStyle w:val="000000000000" w:firstRow="0" w:lastRow="0" w:firstColumn="0" w:lastColumn="0" w:oddVBand="0" w:evenVBand="0" w:oddHBand="0" w:evenHBand="0" w:firstRowFirstColumn="0" w:firstRowLastColumn="0" w:lastRowFirstColumn="0" w:lastRowLastColumn="0"/>
             </w:pPr>
             <w:r>
               <w:rPr>
@@ -7693,6 +7846,9 @@
         </w:tc>
       </w:tr>
       <w:tr>
+        <w:trPr>
+          <w:cnfStyle w:val="000000100000" w:firstRow="0" w:lastRow="0" w:firstColumn="0" w:lastColumn="0" w:oddVBand="0" w:evenVBand="0" w:oddHBand="1" w:evenHBand="0" w:firstRowFirstColumn="0" w:firstRowLastColumn="0" w:lastRowFirstColumn="0" w:lastRowLastColumn="0"/>
+        </w:trPr>
         <w:tc>
           <w:tcPr>
             <w:cnfStyle w:val="001000000000" w:firstRow="0" w:lastRow="0" w:firstColumn="1" w:lastColumn="0" w:oddVBand="0" w:evenVBand="0" w:oddHBand="0" w:evenHBand="0" w:firstRowFirstColumn="0" w:firstRowLastColumn="0" w:lastRowFirstColumn="0" w:lastRowLastColumn="0"/>
@@ -7707,7 +7863,7 @@
                 <w:lang w:val="en-GB"/>
               </w:rPr>
             </w:pPr>
-            <w:hyperlink r:id="rId32" w:history="1">
+            <w:hyperlink r:id="rId33" w:history="1">
               <w:proofErr w:type="spellStart"/>
               <w:r>
                 <w:rPr>
@@ -7740,7 +7896,7 @@
           <w:p>
             <w:pPr>
               <w:jc w:val="center"/>
-              <w:cnfStyle w:val="000000000000" w:firstRow="0" w:lastRow="0" w:firstColumn="0" w:lastColumn="0" w:oddVBand="0" w:evenVBand="0" w:oddHBand="0" w:evenHBand="0" w:firstRowFirstColumn="0" w:firstRowLastColumn="0" w:lastRowFirstColumn="0" w:lastRowLastColumn="0"/>
+              <w:cnfStyle w:val="000000100000" w:firstRow="0" w:lastRow="0" w:firstColumn="0" w:lastColumn="0" w:oddVBand="0" w:evenVBand="0" w:oddHBand="1" w:evenHBand="0" w:firstRowFirstColumn="0" w:firstRowLastColumn="0" w:lastRowFirstColumn="0" w:lastRowLastColumn="0"/>
             </w:pPr>
             <w:r>
               <w:t xml:space="preserve">para baterias </w:t>
@@ -7751,7 +7907,11 @@
             </w:r>
             <w:proofErr w:type="spellEnd"/>
             <w:r>
-              <w:t xml:space="preserve"> 3S</w:t>
+              <w:t xml:space="preserve"> </w:t>
+            </w:r>
+            <w:r>
+              <w:lastRenderedPageBreak/>
+              <w:t>3S</w:t>
             </w:r>
           </w:p>
         </w:tc>
@@ -7764,7 +7924,7 @@
           <w:p>
             <w:pPr>
               <w:jc w:val="center"/>
-              <w:cnfStyle w:val="000000000000" w:firstRow="0" w:lastRow="0" w:firstColumn="0" w:lastColumn="0" w:oddVBand="0" w:evenVBand="0" w:oddHBand="0" w:evenHBand="0" w:firstRowFirstColumn="0" w:firstRowLastColumn="0" w:lastRowFirstColumn="0" w:lastRowLastColumn="0"/>
+              <w:cnfStyle w:val="000000100000" w:firstRow="0" w:lastRow="0" w:firstColumn="0" w:lastColumn="0" w:oddVBand="0" w:evenVBand="0" w:oddHBand="1" w:evenHBand="0" w:firstRowFirstColumn="0" w:firstRowLastColumn="0" w:lastRowFirstColumn="0" w:lastRowLastColumn="0"/>
               <w:rPr>
                 <w:lang w:val="en-GB"/>
               </w:rPr>
@@ -7773,6 +7933,7 @@
               <w:rPr>
                 <w:lang w:val="en-GB"/>
               </w:rPr>
+              <w:lastRenderedPageBreak/>
               <w:t>1x</w:t>
             </w:r>
           </w:p>
@@ -7786,10 +7947,14 @@
           <w:p>
             <w:pPr>
               <w:jc w:val="center"/>
-              <w:cnfStyle w:val="000000000000" w:firstRow="0" w:lastRow="0" w:firstColumn="0" w:lastColumn="0" w:oddVBand="0" w:evenVBand="0" w:oddHBand="0" w:evenHBand="0" w:firstRowFirstColumn="0" w:firstRowLastColumn="0" w:lastRowFirstColumn="0" w:lastRowLastColumn="0"/>
+              <w:cnfStyle w:val="000000100000" w:firstRow="0" w:lastRow="0" w:firstColumn="0" w:lastColumn="0" w:oddVBand="0" w:evenVBand="0" w:oddHBand="1" w:evenHBand="0" w:firstRowFirstColumn="0" w:firstRowLastColumn="0" w:lastRowFirstColumn="0" w:lastRowLastColumn="0"/>
             </w:pPr>
             <w:r>
-              <w:t xml:space="preserve">Recarga segura da bateria do </w:t>
+              <w:t xml:space="preserve">Recarga segura da </w:t>
+            </w:r>
+            <w:r>
+              <w:lastRenderedPageBreak/>
+              <w:t xml:space="preserve">bateria do </w:t>
             </w:r>
             <w:proofErr w:type="spellStart"/>
             <w:r>
@@ -7809,22 +7974,20 @@
           <w:p>
             <w:pPr>
               <w:jc w:val="center"/>
-              <w:cnfStyle w:val="000000000000" w:firstRow="0" w:lastRow="0" w:firstColumn="0" w:lastColumn="0" w:oddVBand="0" w:evenVBand="0" w:oddHBand="0" w:evenHBand="0" w:firstRowFirstColumn="0" w:firstRowLastColumn="0" w:lastRowFirstColumn="0" w:lastRowLastColumn="0"/>
+              <w:cnfStyle w:val="000000100000" w:firstRow="0" w:lastRow="0" w:firstColumn="0" w:lastColumn="0" w:oddVBand="0" w:evenVBand="0" w:oddHBand="1" w:evenHBand="0" w:firstRowFirstColumn="0" w:firstRowLastColumn="0" w:lastRowFirstColumn="0" w:lastRowLastColumn="0"/>
             </w:pPr>
             <w:r>
               <w:rPr>
                 <w:b/>
                 <w:bCs/>
               </w:rPr>
+              <w:lastRenderedPageBreak/>
               <w:t>6,31€</w:t>
             </w:r>
           </w:p>
         </w:tc>
       </w:tr>
       <w:tr>
-        <w:trPr>
-          <w:cnfStyle w:val="000000100000" w:firstRow="0" w:lastRow="0" w:firstColumn="0" w:lastColumn="0" w:oddVBand="0" w:evenVBand="0" w:oddHBand="1" w:evenHBand="0" w:firstRowFirstColumn="0" w:firstRowLastColumn="0" w:lastRowFirstColumn="0" w:lastRowLastColumn="0"/>
-        </w:trPr>
         <w:tc>
           <w:tcPr>
             <w:cnfStyle w:val="001000000000" w:firstRow="0" w:lastRow="0" w:firstColumn="1" w:lastColumn="0" w:oddVBand="0" w:evenVBand="0" w:oddHBand="0" w:evenHBand="0" w:firstRowFirstColumn="0" w:firstRowLastColumn="0" w:lastRowFirstColumn="0" w:lastRowLastColumn="0"/>
@@ -7838,7 +8001,7 @@
                 <w:lang w:val="en-GB"/>
               </w:rPr>
             </w:pPr>
-            <w:hyperlink r:id="rId33" w:history="1">
+            <w:hyperlink r:id="rId34" w:history="1">
               <w:r>
                 <w:rPr>
                   <w:rStyle w:val="Hyperlink"/>
@@ -7859,7 +8022,7 @@
           <w:p>
             <w:pPr>
               <w:jc w:val="center"/>
-              <w:cnfStyle w:val="000000100000" w:firstRow="0" w:lastRow="0" w:firstColumn="0" w:lastColumn="0" w:oddVBand="0" w:evenVBand="0" w:oddHBand="1" w:evenHBand="0" w:firstRowFirstColumn="0" w:firstRowLastColumn="0" w:lastRowFirstColumn="0" w:lastRowLastColumn="0"/>
+              <w:cnfStyle w:val="000000000000" w:firstRow="0" w:lastRow="0" w:firstColumn="0" w:lastColumn="0" w:oddVBand="0" w:evenVBand="0" w:oddHBand="0" w:evenHBand="0" w:firstRowFirstColumn="0" w:firstRowLastColumn="0" w:lastRowFirstColumn="0" w:lastRowLastColumn="0"/>
             </w:pPr>
             <w:proofErr w:type="spellStart"/>
             <w:r>
@@ -7879,14 +8042,7 @@
               <w:rPr>
                 <w:lang w:val="en-GB"/>
               </w:rPr>
-              <w:t xml:space="preserve"> </w:t>
-            </w:r>
-            <w:r>
-              <w:rPr>
-                <w:lang w:val="en-GB"/>
-              </w:rPr>
-              <w:lastRenderedPageBreak/>
-              <w:t xml:space="preserve">(1660 </w:t>
+              <w:t xml:space="preserve"> (1660 </w:t>
             </w:r>
             <w:proofErr w:type="spellStart"/>
             <w:r>
@@ -7912,7 +8068,7 @@
           <w:p>
             <w:pPr>
               <w:jc w:val="center"/>
-              <w:cnfStyle w:val="000000100000" w:firstRow="0" w:lastRow="0" w:firstColumn="0" w:lastColumn="0" w:oddVBand="0" w:evenVBand="0" w:oddHBand="1" w:evenHBand="0" w:firstRowFirstColumn="0" w:firstRowLastColumn="0" w:lastRowFirstColumn="0" w:lastRowLastColumn="0"/>
+              <w:cnfStyle w:val="000000000000" w:firstRow="0" w:lastRow="0" w:firstColumn="0" w:lastColumn="0" w:oddVBand="0" w:evenVBand="0" w:oddHBand="0" w:evenHBand="0" w:firstRowFirstColumn="0" w:firstRowLastColumn="0" w:lastRowFirstColumn="0" w:lastRowLastColumn="0"/>
               <w:rPr>
                 <w:lang w:val="en-GB"/>
               </w:rPr>
@@ -7921,7 +8077,6 @@
               <w:rPr>
                 <w:lang w:val="en-GB"/>
               </w:rPr>
-              <w:lastRenderedPageBreak/>
               <w:t>1x</w:t>
             </w:r>
           </w:p>
@@ -7934,14 +8089,10 @@
           <w:p>
             <w:pPr>
               <w:jc w:val="center"/>
-              <w:cnfStyle w:val="000000100000" w:firstRow="0" w:lastRow="0" w:firstColumn="0" w:lastColumn="0" w:oddVBand="0" w:evenVBand="0" w:oddHBand="1" w:evenHBand="0" w:firstRowFirstColumn="0" w:firstRowLastColumn="0" w:lastRowFirstColumn="0" w:lastRowLastColumn="0"/>
+              <w:cnfStyle w:val="000000000000" w:firstRow="0" w:lastRow="0" w:firstColumn="0" w:lastColumn="0" w:oddVBand="0" w:evenVBand="0" w:oddHBand="0" w:evenHBand="0" w:firstRowFirstColumn="0" w:firstRowLastColumn="0" w:lastRowFirstColumn="0" w:lastRowLastColumn="0"/>
             </w:pPr>
             <w:r>
-              <w:t xml:space="preserve">Prototipagem das </w:t>
-            </w:r>
-            <w:r>
-              <w:lastRenderedPageBreak/>
-              <w:t>conexões elétricas sem solda.</w:t>
+              <w:t>Prototipagem das conexões elétricas sem solda.</w:t>
             </w:r>
           </w:p>
         </w:tc>
@@ -7953,7 +8104,7 @@
           <w:p>
             <w:pPr>
               <w:jc w:val="center"/>
-              <w:cnfStyle w:val="000000100000" w:firstRow="0" w:lastRow="0" w:firstColumn="0" w:lastColumn="0" w:oddVBand="0" w:evenVBand="0" w:oddHBand="1" w:evenHBand="0" w:firstRowFirstColumn="0" w:firstRowLastColumn="0" w:lastRowFirstColumn="0" w:lastRowLastColumn="0"/>
+              <w:cnfStyle w:val="000000000000" w:firstRow="0" w:lastRow="0" w:firstColumn="0" w:lastColumn="0" w:oddVBand="0" w:evenVBand="0" w:oddHBand="0" w:evenHBand="0" w:firstRowFirstColumn="0" w:firstRowLastColumn="0" w:lastRowFirstColumn="0" w:lastRowLastColumn="0"/>
               <w:rPr>
                 <w:b/>
                 <w:bCs/>
@@ -7964,7 +8115,6 @@
                 <w:b/>
                 <w:bCs/>
               </w:rPr>
-              <w:lastRenderedPageBreak/>
               <w:t>7,79</w:t>
             </w:r>
             <w:r>
@@ -7978,6 +8128,9 @@
         </w:tc>
       </w:tr>
       <w:tr>
+        <w:trPr>
+          <w:cnfStyle w:val="000000100000" w:firstRow="0" w:lastRow="0" w:firstColumn="0" w:lastColumn="0" w:oddVBand="0" w:evenVBand="0" w:oddHBand="1" w:evenHBand="0" w:firstRowFirstColumn="0" w:firstRowLastColumn="0" w:lastRowFirstColumn="0" w:lastRowLastColumn="0"/>
+        </w:trPr>
         <w:tc>
           <w:tcPr>
             <w:cnfStyle w:val="001000000000" w:firstRow="0" w:lastRow="0" w:firstColumn="1" w:lastColumn="0" w:oddVBand="0" w:evenVBand="0" w:oddHBand="0" w:evenHBand="0" w:firstRowFirstColumn="0" w:firstRowLastColumn="0" w:lastRowFirstColumn="0" w:lastRowLastColumn="0"/>
@@ -7993,7 +8146,7 @@
                 <w:lang w:val="en-GB"/>
               </w:rPr>
             </w:pPr>
-            <w:hyperlink r:id="rId34" w:history="1">
+            <w:hyperlink r:id="rId35" w:history="1">
               <w:r>
                 <w:rPr>
                   <w:rStyle w:val="Hyperlink"/>
@@ -8025,7 +8178,7 @@
           <w:p>
             <w:pPr>
               <w:jc w:val="center"/>
-              <w:cnfStyle w:val="000000000000" w:firstRow="0" w:lastRow="0" w:firstColumn="0" w:lastColumn="0" w:oddVBand="0" w:evenVBand="0" w:oddHBand="0" w:evenHBand="0" w:firstRowFirstColumn="0" w:firstRowLastColumn="0" w:lastRowFirstColumn="0" w:lastRowLastColumn="0"/>
+              <w:cnfStyle w:val="000000100000" w:firstRow="0" w:lastRow="0" w:firstColumn="0" w:lastColumn="0" w:oddVBand="0" w:evenVBand="0" w:oddHBand="1" w:evenHBand="0" w:firstRowFirstColumn="0" w:firstRowLastColumn="0" w:lastRowFirstColumn="0" w:lastRowLastColumn="0"/>
             </w:pPr>
             <w:r>
               <w:t>Ferro de solda sem fio, 800m</w:t>
@@ -8034,7 +8187,15 @@
               <w:t>A</w:t>
             </w:r>
             <w:r>
-              <w:t xml:space="preserve">h, 300 á </w:t>
+              <w:t xml:space="preserve">h, 300 </w:t>
+            </w:r>
+            <w:proofErr w:type="gramStart"/>
+            <w:r>
+              <w:t>á</w:t>
+            </w:r>
+            <w:proofErr w:type="gramEnd"/>
+            <w:r>
+              <w:t xml:space="preserve"> </w:t>
             </w:r>
             <w:r>
               <w:t>420</w:t>
@@ -8052,7 +8213,7 @@
           <w:p>
             <w:pPr>
               <w:jc w:val="center"/>
-              <w:cnfStyle w:val="000000000000" w:firstRow="0" w:lastRow="0" w:firstColumn="0" w:lastColumn="0" w:oddVBand="0" w:evenVBand="0" w:oddHBand="0" w:evenHBand="0" w:firstRowFirstColumn="0" w:firstRowLastColumn="0" w:lastRowFirstColumn="0" w:lastRowLastColumn="0"/>
+              <w:cnfStyle w:val="000000100000" w:firstRow="0" w:lastRow="0" w:firstColumn="0" w:lastColumn="0" w:oddVBand="0" w:evenVBand="0" w:oddHBand="1" w:evenHBand="0" w:firstRowFirstColumn="0" w:firstRowLastColumn="0" w:lastRowFirstColumn="0" w:lastRowLastColumn="0"/>
               <w:rPr>
                 <w:lang w:val="en-GB"/>
               </w:rPr>
@@ -8073,7 +8234,7 @@
           <w:p>
             <w:pPr>
               <w:jc w:val="center"/>
-              <w:cnfStyle w:val="000000000000" w:firstRow="0" w:lastRow="0" w:firstColumn="0" w:lastColumn="0" w:oddVBand="0" w:evenVBand="0" w:oddHBand="0" w:evenHBand="0" w:firstRowFirstColumn="0" w:firstRowLastColumn="0" w:lastRowFirstColumn="0" w:lastRowLastColumn="0"/>
+              <w:cnfStyle w:val="000000100000" w:firstRow="0" w:lastRow="0" w:firstColumn="0" w:lastColumn="0" w:oddVBand="0" w:evenVBand="0" w:oddHBand="1" w:evenHBand="0" w:firstRowFirstColumn="0" w:firstRowLastColumn="0" w:lastRowFirstColumn="0" w:lastRowLastColumn="0"/>
             </w:pPr>
             <w:r>
               <w:t xml:space="preserve">Para </w:t>
@@ -8107,7 +8268,7 @@
           <w:p>
             <w:pPr>
               <w:jc w:val="center"/>
-              <w:cnfStyle w:val="000000000000" w:firstRow="0" w:lastRow="0" w:firstColumn="0" w:lastColumn="0" w:oddVBand="0" w:evenVBand="0" w:oddHBand="0" w:evenHBand="0" w:firstRowFirstColumn="0" w:firstRowLastColumn="0" w:lastRowFirstColumn="0" w:lastRowLastColumn="0"/>
+              <w:cnfStyle w:val="000000100000" w:firstRow="0" w:lastRow="0" w:firstColumn="0" w:lastColumn="0" w:oddVBand="0" w:evenVBand="0" w:oddHBand="1" w:evenHBand="0" w:firstRowFirstColumn="0" w:firstRowLastColumn="0" w:lastRowFirstColumn="0" w:lastRowLastColumn="0"/>
               <w:rPr>
                 <w:b/>
                 <w:bCs/>
@@ -8138,9 +8299,6 @@
         </w:tc>
       </w:tr>
       <w:tr>
-        <w:trPr>
-          <w:cnfStyle w:val="000000100000" w:firstRow="0" w:lastRow="0" w:firstColumn="0" w:lastColumn="0" w:oddVBand="0" w:evenVBand="0" w:oddHBand="1" w:evenHBand="0" w:firstRowFirstColumn="0" w:firstRowLastColumn="0" w:lastRowFirstColumn="0" w:lastRowLastColumn="0"/>
-        </w:trPr>
         <w:tc>
           <w:tcPr>
             <w:cnfStyle w:val="001000000000" w:firstRow="0" w:lastRow="0" w:firstColumn="1" w:lastColumn="0" w:oddVBand="0" w:evenVBand="0" w:oddHBand="0" w:evenHBand="0" w:firstRowFirstColumn="0" w:firstRowLastColumn="0" w:lastRowFirstColumn="0" w:lastRowLastColumn="0"/>
@@ -8154,7 +8312,7 @@
                 <w:lang w:val="en-GB"/>
               </w:rPr>
             </w:pPr>
-            <w:hyperlink r:id="rId35" w:history="1">
+            <w:hyperlink r:id="rId36" w:history="1">
               <w:r>
                 <w:rPr>
                   <w:rStyle w:val="Hyperlink"/>
@@ -8186,35 +8344,171 @@
           <w:p>
             <w:pPr>
               <w:jc w:val="center"/>
+              <w:cnfStyle w:val="000000000000" w:firstRow="0" w:lastRow="0" w:firstColumn="0" w:lastColumn="0" w:oddVBand="0" w:evenVBand="0" w:oddHBand="0" w:evenHBand="0" w:firstRowFirstColumn="0" w:firstRowLastColumn="0" w:lastRowFirstColumn="0" w:lastRowLastColumn="0"/>
+            </w:pPr>
+            <w:r>
+              <w:t>Fluxo, Estanho e Almofada</w:t>
+            </w:r>
+            <w:r>
+              <w:t xml:space="preserve">, </w:t>
+            </w:r>
+            <w:proofErr w:type="spellStart"/>
+            <w:r>
+              <w:t>dessoldador</w:t>
+            </w:r>
+            <w:proofErr w:type="spellEnd"/>
+            <w:r>
+              <w:t xml:space="preserve">, </w:t>
+            </w:r>
+            <w:proofErr w:type="spellStart"/>
+            <w:r>
+              <w:t>desencapador</w:t>
+            </w:r>
+            <w:proofErr w:type="spellEnd"/>
+            <w:r>
+              <w:t>, e pin</w:t>
+            </w:r>
+            <w:r>
+              <w:t>ç</w:t>
+            </w:r>
+            <w:r>
+              <w:t>as</w:t>
+            </w:r>
+          </w:p>
+        </w:tc>
+        <w:tc>
+          <w:tcPr>
+            <w:tcW w:w="1843" w:type="dxa"/>
+            <w:vAlign w:val="center"/>
+          </w:tcPr>
+          <w:p>
+            <w:pPr>
+              <w:jc w:val="center"/>
+              <w:cnfStyle w:val="000000000000" w:firstRow="0" w:lastRow="0" w:firstColumn="0" w:lastColumn="0" w:oddVBand="0" w:evenVBand="0" w:oddHBand="0" w:evenHBand="0" w:firstRowFirstColumn="0" w:firstRowLastColumn="0" w:lastRowFirstColumn="0" w:lastRowLastColumn="0"/>
+              <w:rPr>
+                <w:lang w:val="en-GB"/>
+              </w:rPr>
+            </w:pPr>
+            <w:r>
+              <w:rPr>
+                <w:lang w:val="en-GB"/>
+              </w:rPr>
+              <w:t>1 kit</w:t>
+            </w:r>
+          </w:p>
+        </w:tc>
+        <w:tc>
+          <w:tcPr>
+            <w:tcW w:w="2410" w:type="dxa"/>
+            <w:vAlign w:val="center"/>
+          </w:tcPr>
+          <w:p>
+            <w:pPr>
+              <w:jc w:val="center"/>
+              <w:cnfStyle w:val="000000000000" w:firstRow="0" w:lastRow="0" w:firstColumn="0" w:lastColumn="0" w:oddVBand="0" w:evenVBand="0" w:oddHBand="0" w:evenHBand="0" w:firstRowFirstColumn="0" w:firstRowLastColumn="0" w:lastRowFirstColumn="0" w:lastRowLastColumn="0"/>
+            </w:pPr>
+            <w:r>
+              <w:t>Montagem final e fixação definitiva dos componentes.</w:t>
+            </w:r>
+          </w:p>
+        </w:tc>
+        <w:tc>
+          <w:tcPr>
+            <w:tcW w:w="1275" w:type="dxa"/>
+            <w:vAlign w:val="center"/>
+          </w:tcPr>
+          <w:p>
+            <w:pPr>
+              <w:jc w:val="center"/>
+              <w:cnfStyle w:val="000000000000" w:firstRow="0" w:lastRow="0" w:firstColumn="0" w:lastColumn="0" w:oddVBand="0" w:evenVBand="0" w:oddHBand="0" w:evenHBand="0" w:firstRowFirstColumn="0" w:firstRowLastColumn="0" w:lastRowFirstColumn="0" w:lastRowLastColumn="0"/>
+            </w:pPr>
+            <w:r>
+              <w:rPr>
+                <w:b/>
+                <w:bCs/>
+              </w:rPr>
+              <w:t>9</w:t>
+            </w:r>
+            <w:r>
+              <w:rPr>
+                <w:b/>
+                <w:bCs/>
+              </w:rPr>
+              <w:t>€</w:t>
+            </w:r>
+          </w:p>
+        </w:tc>
+      </w:tr>
+      <w:bookmarkStart w:id="50" w:name="_Hlk229341342"/>
+      <w:tr>
+        <w:trPr>
+          <w:cnfStyle w:val="000000100000" w:firstRow="0" w:lastRow="0" w:firstColumn="0" w:lastColumn="0" w:oddVBand="0" w:evenVBand="0" w:oddHBand="1" w:evenHBand="0" w:firstRowFirstColumn="0" w:firstRowLastColumn="0" w:lastRowFirstColumn="0" w:lastRowLastColumn="0"/>
+        </w:trPr>
+        <w:tc>
+          <w:tcPr>
+            <w:cnfStyle w:val="001000000000" w:firstRow="0" w:lastRow="0" w:firstColumn="1" w:lastColumn="0" w:oddVBand="0" w:evenVBand="0" w:oddHBand="0" w:evenHBand="0" w:firstRowFirstColumn="0" w:firstRowLastColumn="0" w:lastRowFirstColumn="0" w:lastRowLastColumn="0"/>
+            <w:tcW w:w="1843" w:type="dxa"/>
+            <w:vAlign w:val="center"/>
+          </w:tcPr>
+          <w:p>
+            <w:pPr>
+              <w:jc w:val="center"/>
+              <w:rPr>
+                <w:lang w:val="en-GB"/>
+              </w:rPr>
+            </w:pPr>
+            <w:r>
+              <w:rPr>
+                <w:lang w:val="en-GB"/>
+              </w:rPr>
+              <w:fldChar w:fldCharType="begin"/>
+            </w:r>
+            <w:r>
+              <w:rPr>
+                <w:lang w:val="en-GB"/>
+              </w:rPr>
+              <w:instrText>HYPERLINK "https://pt.aliexpress.com/item/1005007476773547.html"</w:instrText>
+            </w:r>
+            <w:r>
+              <w:rPr>
+                <w:lang w:val="en-GB"/>
+              </w:rPr>
+            </w:r>
+            <w:r>
+              <w:rPr>
+                <w:lang w:val="en-GB"/>
+              </w:rPr>
+              <w:fldChar w:fldCharType="separate"/>
+            </w:r>
+            <w:r>
+              <w:rPr>
+                <w:rStyle w:val="Hyperlink"/>
+                <w:b w:val="0"/>
+                <w:bCs w:val="0"/>
+                <w:lang w:val="en-GB"/>
+              </w:rPr>
+              <w:t>Cabo USB C</w:t>
+            </w:r>
+            <w:r>
+              <w:rPr>
+                <w:lang w:val="en-GB"/>
+              </w:rPr>
+              <w:fldChar w:fldCharType="end"/>
+            </w:r>
+          </w:p>
+        </w:tc>
+        <w:tc>
+          <w:tcPr>
+            <w:tcW w:w="2268" w:type="dxa"/>
+            <w:vAlign w:val="center"/>
+          </w:tcPr>
+          <w:p>
+            <w:pPr>
+              <w:jc w:val="center"/>
               <w:cnfStyle w:val="000000100000" w:firstRow="0" w:lastRow="0" w:firstColumn="0" w:lastColumn="0" w:oddVBand="0" w:evenVBand="0" w:oddHBand="1" w:evenHBand="0" w:firstRowFirstColumn="0" w:firstRowLastColumn="0" w:lastRowFirstColumn="0" w:lastRowLastColumn="0"/>
             </w:pPr>
             <w:r>
-              <w:t>Fluxo, Estanho e Almofada</w:t>
-            </w:r>
-            <w:r>
-              <w:t xml:space="preserve">, </w:t>
-            </w:r>
-            <w:proofErr w:type="spellStart"/>
-            <w:r>
-              <w:t>dessoldador</w:t>
-            </w:r>
-            <w:proofErr w:type="spellEnd"/>
-            <w:r>
-              <w:t xml:space="preserve">, </w:t>
-            </w:r>
-            <w:proofErr w:type="spellStart"/>
-            <w:r>
-              <w:t>desencapador</w:t>
-            </w:r>
-            <w:proofErr w:type="spellEnd"/>
-            <w:r>
-              <w:t>, e pin</w:t>
-            </w:r>
-            <w:r>
-              <w:t>ç</w:t>
-            </w:r>
-            <w:r>
-              <w:t>as</w:t>
+              <w:t>Pino de passagem de dados</w:t>
             </w:r>
           </w:p>
         </w:tc>
@@ -8232,10 +8526,7 @@
               </w:rPr>
             </w:pPr>
             <w:r>
-              <w:rPr>
-                <w:lang w:val="en-GB"/>
-              </w:rPr>
-              <w:t>1 kit</w:t>
+              <w:t>1x</w:t>
             </w:r>
           </w:p>
         </w:tc>
@@ -8250,7 +8541,7 @@
               <w:cnfStyle w:val="000000100000" w:firstRow="0" w:lastRow="0" w:firstColumn="0" w:lastColumn="0" w:oddVBand="0" w:evenVBand="0" w:oddHBand="1" w:evenHBand="0" w:firstRowFirstColumn="0" w:firstRowLastColumn="0" w:lastRowFirstColumn="0" w:lastRowLastColumn="0"/>
             </w:pPr>
             <w:r>
-              <w:t>Montagem final e fixação definitiva dos componentes.</w:t>
+              <w:t>Gerenciar a memória do microcontrolador pelo computador.</w:t>
             </w:r>
           </w:p>
         </w:tc>
@@ -8269,19 +8560,32 @@
                 <w:b/>
                 <w:bCs/>
               </w:rPr>
-              <w:t>9</w:t>
+              <w:t>2</w:t>
             </w:r>
             <w:r>
               <w:rPr>
                 <w:b/>
                 <w:bCs/>
               </w:rPr>
-              <w:t>€</w:t>
+              <w:t>,</w:t>
+            </w:r>
+            <w:r>
+              <w:rPr>
+                <w:b/>
+                <w:bCs/>
+              </w:rPr>
+              <w:t>5</w:t>
+            </w:r>
+            <w:r>
+              <w:rPr>
+                <w:b/>
+                <w:bCs/>
+              </w:rPr>
+              <w:t>9€</w:t>
             </w:r>
           </w:p>
         </w:tc>
       </w:tr>
-      <w:bookmarkStart w:id="50" w:name="_Hlk229341342"/>
       <w:tr>
         <w:tc>
           <w:tcPr>
@@ -8300,39 +8604,7 @@
               <w:rPr>
                 <w:lang w:val="en-GB"/>
               </w:rPr>
-              <w:fldChar w:fldCharType="begin"/>
-            </w:r>
-            <w:r>
-              <w:rPr>
-                <w:lang w:val="en-GB"/>
-              </w:rPr>
-              <w:instrText>HYPERLINK "https://pt.aliexpress.com/item/1005007476773547.html"</w:instrText>
-            </w:r>
-            <w:r>
-              <w:rPr>
-                <w:lang w:val="en-GB"/>
-              </w:rPr>
-            </w:r>
-            <w:r>
-              <w:rPr>
-                <w:lang w:val="en-GB"/>
-              </w:rPr>
-              <w:fldChar w:fldCharType="separate"/>
-            </w:r>
-            <w:r>
-              <w:rPr>
-                <w:rStyle w:val="Hyperlink"/>
-                <w:b w:val="0"/>
-                <w:bCs w:val="0"/>
-                <w:lang w:val="en-GB"/>
-              </w:rPr>
-              <w:t>Cabo USB C</w:t>
-            </w:r>
-            <w:r>
-              <w:rPr>
-                <w:lang w:val="en-GB"/>
-              </w:rPr>
-              <w:fldChar w:fldCharType="end"/>
+              <w:t>Fio jumper MF</w:t>
             </w:r>
           </w:p>
         </w:tc>
@@ -8347,7 +8619,7 @@
               <w:cnfStyle w:val="000000000000" w:firstRow="0" w:lastRow="0" w:firstColumn="0" w:lastColumn="0" w:oddVBand="0" w:evenVBand="0" w:oddHBand="0" w:evenHBand="0" w:firstRowFirstColumn="0" w:firstRowLastColumn="0" w:lastRowFirstColumn="0" w:lastRowLastColumn="0"/>
             </w:pPr>
             <w:r>
-              <w:t>Pino de passagem de dados</w:t>
+              <w:t>Macho-fêmea, 30cm</w:t>
             </w:r>
           </w:p>
         </w:tc>
@@ -8360,12 +8632,9 @@
             <w:pPr>
               <w:jc w:val="center"/>
               <w:cnfStyle w:val="000000000000" w:firstRow="0" w:lastRow="0" w:firstColumn="0" w:lastColumn="0" w:oddVBand="0" w:evenVBand="0" w:oddHBand="0" w:evenHBand="0" w:firstRowFirstColumn="0" w:firstRowLastColumn="0" w:lastRowFirstColumn="0" w:lastRowLastColumn="0"/>
-              <w:rPr>
-                <w:lang w:val="en-GB"/>
-              </w:rPr>
             </w:pPr>
             <w:r>
-              <w:t>1x</w:t>
+              <w:t>20x</w:t>
             </w:r>
           </w:p>
         </w:tc>
@@ -8380,7 +8649,7 @@
               <w:cnfStyle w:val="000000000000" w:firstRow="0" w:lastRow="0" w:firstColumn="0" w:lastColumn="0" w:oddVBand="0" w:evenVBand="0" w:oddHBand="0" w:evenHBand="0" w:firstRowFirstColumn="0" w:firstRowLastColumn="0" w:lastRowFirstColumn="0" w:lastRowLastColumn="0"/>
             </w:pPr>
             <w:r>
-              <w:t>Gerenciar a memória do microcontrolador pelo computador.</w:t>
+              <w:t>Conectar a bateria nos dois esp32.</w:t>
             </w:r>
           </w:p>
         </w:tc>
@@ -8393,34 +8662,24 @@
             <w:pPr>
               <w:jc w:val="center"/>
               <w:cnfStyle w:val="000000000000" w:firstRow="0" w:lastRow="0" w:firstColumn="0" w:lastColumn="0" w:oddVBand="0" w:evenVBand="0" w:oddHBand="0" w:evenHBand="0" w:firstRowFirstColumn="0" w:firstRowLastColumn="0" w:lastRowFirstColumn="0" w:lastRowLastColumn="0"/>
-            </w:pPr>
-            <w:r>
               <w:rPr>
                 <w:b/>
                 <w:bCs/>
               </w:rPr>
-              <w:t>2</w:t>
-            </w:r>
+            </w:pPr>
             <w:r>
               <w:rPr>
                 <w:b/>
                 <w:bCs/>
               </w:rPr>
-              <w:t>,</w:t>
+              <w:t>1,81</w:t>
             </w:r>
             <w:r>
               <w:rPr>
                 <w:b/>
                 <w:bCs/>
               </w:rPr>
-              <w:t>5</w:t>
-            </w:r>
-            <w:r>
-              <w:rPr>
-                <w:b/>
-                <w:bCs/>
-              </w:rPr>
-              <w:t>9€</w:t>
+              <w:t>€</w:t>
             </w:r>
           </w:p>
         </w:tc>
@@ -8446,7 +8705,7 @@
               <w:rPr>
                 <w:lang w:val="en-GB"/>
               </w:rPr>
-              <w:t>Fio jumper MF</w:t>
+              <w:t>Fio jumper FF</w:t>
             </w:r>
           </w:p>
         </w:tc>
@@ -8460,8 +8719,13 @@
               <w:jc w:val="center"/>
               <w:cnfStyle w:val="000000100000" w:firstRow="0" w:lastRow="0" w:firstColumn="0" w:lastColumn="0" w:oddVBand="0" w:evenVBand="0" w:oddHBand="1" w:evenHBand="0" w:firstRowFirstColumn="0" w:firstRowLastColumn="0" w:lastRowFirstColumn="0" w:lastRowLastColumn="0"/>
             </w:pPr>
-            <w:r>
-              <w:t>Macho-fêmea, 30cm</w:t>
+            <w:proofErr w:type="spellStart"/>
+            <w:r>
+              <w:t>Femêa</w:t>
+            </w:r>
+            <w:proofErr w:type="spellEnd"/>
+            <w:r>
+              <w:t>-fêmea, 30cm</w:t>
             </w:r>
           </w:p>
         </w:tc>
@@ -8491,7 +8755,7 @@
               <w:cnfStyle w:val="000000100000" w:firstRow="0" w:lastRow="0" w:firstColumn="0" w:lastColumn="0" w:oddVBand="0" w:evenVBand="0" w:oddHBand="1" w:evenHBand="0" w:firstRowFirstColumn="0" w:firstRowLastColumn="0" w:lastRowFirstColumn="0" w:lastRowLastColumn="0"/>
             </w:pPr>
             <w:r>
-              <w:t>Conectar a bateria nos dois esp32.</w:t>
+              <w:t>Conectar os componentes entre si</w:t>
             </w:r>
           </w:p>
         </w:tc>
@@ -8537,6 +8801,9 @@
             <w:pPr>
               <w:jc w:val="center"/>
               <w:rPr>
+                <w:rStyle w:val="Hyperlink"/>
+                <w:b w:val="0"/>
+                <w:bCs w:val="0"/>
                 <w:lang w:val="en-GB"/>
               </w:rPr>
             </w:pPr>
@@ -8544,7 +8811,78 @@
               <w:rPr>
                 <w:lang w:val="en-GB"/>
               </w:rPr>
-              <w:t>Fio jumper FF</w:t>
+              <w:fldChar w:fldCharType="begin"/>
+            </w:r>
+            <w:r>
+              <w:rPr>
+                <w:lang w:val="en-GB"/>
+              </w:rPr>
+              <w:instrText>HYPERLINK "https://www.leroymerlin.pt/produtos/oculos-de-protecao-ajustaveis-transparentes-tamanho-unico-88035238.html"</w:instrText>
+            </w:r>
+            <w:r>
+              <w:rPr>
+                <w:lang w:val="en-GB"/>
+              </w:rPr>
+            </w:r>
+            <w:r>
+              <w:rPr>
+                <w:lang w:val="en-GB"/>
+              </w:rPr>
+              <w:fldChar w:fldCharType="separate"/>
+            </w:r>
+            <w:proofErr w:type="spellStart"/>
+            <w:r>
+              <w:rPr>
+                <w:rStyle w:val="Hyperlink"/>
+                <w:b w:val="0"/>
+                <w:bCs w:val="0"/>
+                <w:lang w:val="en-GB"/>
+              </w:rPr>
+              <w:t>Óculos</w:t>
+            </w:r>
+            <w:proofErr w:type="spellEnd"/>
+            <w:r>
+              <w:rPr>
+                <w:rStyle w:val="Hyperlink"/>
+                <w:b w:val="0"/>
+                <w:bCs w:val="0"/>
+                <w:lang w:val="en-GB"/>
+              </w:rPr>
+              <w:t xml:space="preserve"> de </w:t>
+            </w:r>
+            <w:proofErr w:type="spellStart"/>
+            <w:r>
+              <w:rPr>
+                <w:rStyle w:val="Hyperlink"/>
+                <w:b w:val="0"/>
+                <w:bCs w:val="0"/>
+                <w:lang w:val="en-GB"/>
+              </w:rPr>
+              <w:t>proteção</w:t>
+            </w:r>
+            <w:proofErr w:type="spellEnd"/>
+          </w:p>
+          <w:p>
+            <w:pPr>
+              <w:jc w:val="center"/>
+              <w:rPr>
+                <w:lang w:val="en-GB"/>
+              </w:rPr>
+            </w:pPr>
+            <w:r>
+              <w:rPr>
+                <w:rStyle w:val="Hyperlink"/>
+                <w:b w:val="0"/>
+                <w:bCs w:val="0"/>
+                <w:lang w:val="en-GB"/>
+              </w:rPr>
+              <w:t>(EPI)</w:t>
+            </w:r>
+            <w:r>
+              <w:rPr>
+                <w:lang w:val="en-GB"/>
+              </w:rPr>
+              <w:fldChar w:fldCharType="end"/>
             </w:r>
           </w:p>
         </w:tc>
@@ -8557,15 +8895,38 @@
             <w:pPr>
               <w:jc w:val="center"/>
               <w:cnfStyle w:val="000000000000" w:firstRow="0" w:lastRow="0" w:firstColumn="0" w:lastColumn="0" w:oddVBand="0" w:evenVBand="0" w:oddHBand="0" w:evenHBand="0" w:firstRowFirstColumn="0" w:firstRowLastColumn="0" w:lastRowFirstColumn="0" w:lastRowLastColumn="0"/>
+              <w:rPr>
+                <w:lang w:val="en-GB"/>
+              </w:rPr>
             </w:pPr>
             <w:proofErr w:type="spellStart"/>
             <w:r>
-              <w:t>Femêa</w:t>
+              <w:rPr>
+                <w:lang w:val="en-GB"/>
+              </w:rPr>
+              <w:t>ajustáveis</w:t>
             </w:r>
             <w:proofErr w:type="spellEnd"/>
             <w:r>
-              <w:t>-fêmea, 30cm</w:t>
-            </w:r>
+              <w:rPr>
+                <w:lang w:val="en-GB"/>
+              </w:rPr>
+              <w:t xml:space="preserve"> </w:t>
+            </w:r>
+            <w:proofErr w:type="spellStart"/>
+            <w:r>
+              <w:rPr>
+                <w:lang w:val="en-GB"/>
+              </w:rPr>
+              <w:t>transparentes</w:t>
+            </w:r>
+            <w:proofErr w:type="spellEnd"/>
+          </w:p>
+          <w:p>
+            <w:pPr>
+              <w:jc w:val="center"/>
+              <w:cnfStyle w:val="000000000000" w:firstRow="0" w:lastRow="0" w:firstColumn="0" w:lastColumn="0" w:oddVBand="0" w:evenVBand="0" w:oddHBand="0" w:evenHBand="0" w:firstRowFirstColumn="0" w:firstRowLastColumn="0" w:lastRowFirstColumn="0" w:lastRowLastColumn="0"/>
+            </w:pPr>
           </w:p>
         </w:tc>
         <w:tc>
@@ -8579,7 +8940,7 @@
               <w:cnfStyle w:val="000000000000" w:firstRow="0" w:lastRow="0" w:firstColumn="0" w:lastColumn="0" w:oddVBand="0" w:evenVBand="0" w:oddHBand="0" w:evenHBand="0" w:firstRowFirstColumn="0" w:firstRowLastColumn="0" w:lastRowFirstColumn="0" w:lastRowLastColumn="0"/>
             </w:pPr>
             <w:r>
-              <w:t>20x</w:t>
+              <w:t>1x</w:t>
             </w:r>
           </w:p>
         </w:tc>
@@ -8594,7 +8955,7 @@
               <w:cnfStyle w:val="000000000000" w:firstRow="0" w:lastRow="0" w:firstColumn="0" w:lastColumn="0" w:oddVBand="0" w:evenVBand="0" w:oddHBand="0" w:evenHBand="0" w:firstRowFirstColumn="0" w:firstRowLastColumn="0" w:lastRowFirstColumn="0" w:lastRowLastColumn="0"/>
             </w:pPr>
             <w:r>
-              <w:t>Conectar os componentes entre si</w:t>
+              <w:t>Proteger de fragmentos das hélices</w:t>
             </w:r>
           </w:p>
         </w:tc>
@@ -8617,209 +8978,6 @@
                 <w:b/>
                 <w:bCs/>
               </w:rPr>
-              <w:t>1,81</w:t>
-            </w:r>
-            <w:r>
-              <w:rPr>
-                <w:b/>
-                <w:bCs/>
-              </w:rPr>
-              <w:t>€</w:t>
-            </w:r>
-          </w:p>
-        </w:tc>
-      </w:tr>
-      <w:tr>
-        <w:trPr>
-          <w:cnfStyle w:val="000000100000" w:firstRow="0" w:lastRow="0" w:firstColumn="0" w:lastColumn="0" w:oddVBand="0" w:evenVBand="0" w:oddHBand="1" w:evenHBand="0" w:firstRowFirstColumn="0" w:firstRowLastColumn="0" w:lastRowFirstColumn="0" w:lastRowLastColumn="0"/>
-        </w:trPr>
-        <w:tc>
-          <w:tcPr>
-            <w:cnfStyle w:val="001000000000" w:firstRow="0" w:lastRow="0" w:firstColumn="1" w:lastColumn="0" w:oddVBand="0" w:evenVBand="0" w:oddHBand="0" w:evenHBand="0" w:firstRowFirstColumn="0" w:firstRowLastColumn="0" w:lastRowFirstColumn="0" w:lastRowLastColumn="0"/>
-            <w:tcW w:w="1843" w:type="dxa"/>
-            <w:vAlign w:val="center"/>
-          </w:tcPr>
-          <w:p>
-            <w:pPr>
-              <w:jc w:val="center"/>
-              <w:rPr>
-                <w:rStyle w:val="Hyperlink"/>
-                <w:b w:val="0"/>
-                <w:bCs w:val="0"/>
-                <w:lang w:val="en-GB"/>
-              </w:rPr>
-            </w:pPr>
-            <w:r>
-              <w:rPr>
-                <w:lang w:val="en-GB"/>
-              </w:rPr>
-              <w:fldChar w:fldCharType="begin"/>
-            </w:r>
-            <w:r>
-              <w:rPr>
-                <w:lang w:val="en-GB"/>
-              </w:rPr>
-              <w:instrText>HYPERLINK "https://www.leroymerlin.pt/produtos/oculos-de-protecao-ajustaveis-transparentes-tamanho-unico-88035238.html"</w:instrText>
-            </w:r>
-            <w:r>
-              <w:rPr>
-                <w:lang w:val="en-GB"/>
-              </w:rPr>
-            </w:r>
-            <w:r>
-              <w:rPr>
-                <w:lang w:val="en-GB"/>
-              </w:rPr>
-              <w:fldChar w:fldCharType="separate"/>
-            </w:r>
-            <w:proofErr w:type="spellStart"/>
-            <w:r>
-              <w:rPr>
-                <w:rStyle w:val="Hyperlink"/>
-                <w:b w:val="0"/>
-                <w:bCs w:val="0"/>
-                <w:lang w:val="en-GB"/>
-              </w:rPr>
-              <w:t>Óculos</w:t>
-            </w:r>
-            <w:proofErr w:type="spellEnd"/>
-            <w:r>
-              <w:rPr>
-                <w:rStyle w:val="Hyperlink"/>
-                <w:b w:val="0"/>
-                <w:bCs w:val="0"/>
-                <w:lang w:val="en-GB"/>
-              </w:rPr>
-              <w:t xml:space="preserve"> de </w:t>
-            </w:r>
-            <w:proofErr w:type="spellStart"/>
-            <w:r>
-              <w:rPr>
-                <w:rStyle w:val="Hyperlink"/>
-                <w:b w:val="0"/>
-                <w:bCs w:val="0"/>
-                <w:lang w:val="en-GB"/>
-              </w:rPr>
-              <w:t>proteção</w:t>
-            </w:r>
-            <w:proofErr w:type="spellEnd"/>
-          </w:p>
-          <w:p>
-            <w:pPr>
-              <w:jc w:val="center"/>
-              <w:rPr>
-                <w:lang w:val="en-GB"/>
-              </w:rPr>
-            </w:pPr>
-            <w:r>
-              <w:rPr>
-                <w:rStyle w:val="Hyperlink"/>
-                <w:b w:val="0"/>
-                <w:bCs w:val="0"/>
-                <w:lang w:val="en-GB"/>
-              </w:rPr>
-              <w:t>(EPI)</w:t>
-            </w:r>
-            <w:r>
-              <w:rPr>
-                <w:lang w:val="en-GB"/>
-              </w:rPr>
-              <w:fldChar w:fldCharType="end"/>
-            </w:r>
-          </w:p>
-        </w:tc>
-        <w:tc>
-          <w:tcPr>
-            <w:tcW w:w="2268" w:type="dxa"/>
-            <w:vAlign w:val="center"/>
-          </w:tcPr>
-          <w:p>
-            <w:pPr>
-              <w:jc w:val="center"/>
-              <w:cnfStyle w:val="000000100000" w:firstRow="0" w:lastRow="0" w:firstColumn="0" w:lastColumn="0" w:oddVBand="0" w:evenVBand="0" w:oddHBand="1" w:evenHBand="0" w:firstRowFirstColumn="0" w:firstRowLastColumn="0" w:lastRowFirstColumn="0" w:lastRowLastColumn="0"/>
-              <w:rPr>
-                <w:lang w:val="en-GB"/>
-              </w:rPr>
-            </w:pPr>
-            <w:proofErr w:type="spellStart"/>
-            <w:r>
-              <w:rPr>
-                <w:lang w:val="en-GB"/>
-              </w:rPr>
-              <w:t>ajustáveis</w:t>
-            </w:r>
-            <w:proofErr w:type="spellEnd"/>
-            <w:r>
-              <w:rPr>
-                <w:lang w:val="en-GB"/>
-              </w:rPr>
-              <w:t xml:space="preserve"> </w:t>
-            </w:r>
-            <w:proofErr w:type="spellStart"/>
-            <w:r>
-              <w:rPr>
-                <w:lang w:val="en-GB"/>
-              </w:rPr>
-              <w:t>transparentes</w:t>
-            </w:r>
-            <w:proofErr w:type="spellEnd"/>
-          </w:p>
-          <w:p>
-            <w:pPr>
-              <w:jc w:val="center"/>
-              <w:cnfStyle w:val="000000100000" w:firstRow="0" w:lastRow="0" w:firstColumn="0" w:lastColumn="0" w:oddVBand="0" w:evenVBand="0" w:oddHBand="1" w:evenHBand="0" w:firstRowFirstColumn="0" w:firstRowLastColumn="0" w:lastRowFirstColumn="0" w:lastRowLastColumn="0"/>
-            </w:pPr>
-          </w:p>
-        </w:tc>
-        <w:tc>
-          <w:tcPr>
-            <w:tcW w:w="1843" w:type="dxa"/>
-            <w:vAlign w:val="center"/>
-          </w:tcPr>
-          <w:p>
-            <w:pPr>
-              <w:jc w:val="center"/>
-              <w:cnfStyle w:val="000000100000" w:firstRow="0" w:lastRow="0" w:firstColumn="0" w:lastColumn="0" w:oddVBand="0" w:evenVBand="0" w:oddHBand="1" w:evenHBand="0" w:firstRowFirstColumn="0" w:firstRowLastColumn="0" w:lastRowFirstColumn="0" w:lastRowLastColumn="0"/>
-            </w:pPr>
-            <w:r>
-              <w:t>1x</w:t>
-            </w:r>
-          </w:p>
-        </w:tc>
-        <w:tc>
-          <w:tcPr>
-            <w:tcW w:w="2410" w:type="dxa"/>
-            <w:vAlign w:val="center"/>
-          </w:tcPr>
-          <w:p>
-            <w:pPr>
-              <w:jc w:val="center"/>
-              <w:cnfStyle w:val="000000100000" w:firstRow="0" w:lastRow="0" w:firstColumn="0" w:lastColumn="0" w:oddVBand="0" w:evenVBand="0" w:oddHBand="1" w:evenHBand="0" w:firstRowFirstColumn="0" w:firstRowLastColumn="0" w:lastRowFirstColumn="0" w:lastRowLastColumn="0"/>
-            </w:pPr>
-            <w:r>
-              <w:t>Proteger de fragmentos das hélices</w:t>
-            </w:r>
-          </w:p>
-        </w:tc>
-        <w:tc>
-          <w:tcPr>
-            <w:tcW w:w="1275" w:type="dxa"/>
-            <w:vAlign w:val="center"/>
-          </w:tcPr>
-          <w:p>
-            <w:pPr>
-              <w:jc w:val="center"/>
-              <w:cnfStyle w:val="000000100000" w:firstRow="0" w:lastRow="0" w:firstColumn="0" w:lastColumn="0" w:oddVBand="0" w:evenVBand="0" w:oddHBand="1" w:evenHBand="0" w:firstRowFirstColumn="0" w:firstRowLastColumn="0" w:lastRowFirstColumn="0" w:lastRowLastColumn="0"/>
-              <w:rPr>
-                <w:b/>
-                <w:bCs/>
-              </w:rPr>
-            </w:pPr>
-            <w:r>
-              <w:rPr>
-                <w:b/>
-                <w:bCs/>
-              </w:rPr>
               <w:t>1,49</w:t>
             </w:r>
             <w:r>
@@ -8866,7 +9024,7 @@
       <w:proofErr w:type="spellEnd"/>
     </w:p>
     <w:p>
-      <w:hyperlink r:id="rId36" w:history="1">
+      <w:hyperlink r:id="rId37" w:history="1">
         <w:proofErr w:type="spellStart"/>
         <w:r>
           <w:rPr>
@@ -8906,7 +9064,7 @@
                     </pic:cNvPicPr>
                   </pic:nvPicPr>
                   <pic:blipFill>
-                    <a:blip r:embed="rId37" cstate="print">
+                    <a:blip r:embed="rId38" cstate="print">
                       <a:extLst>
                         <a:ext uri="{28A0092B-C50C-407E-A947-70E740481C1C}">
                           <a14:useLocalDpi xmlns:a14="http://schemas.microsoft.com/office/drawing/2010/main" val="0"/>
@@ -8944,6 +9102,7 @@
       </w:pPr>
       <w:bookmarkStart w:id="54" w:name="_Toc229952473"/>
       <w:r>
+        <w:lastRenderedPageBreak/>
         <w:t>Esptool.py</w:t>
       </w:r>
       <w:bookmarkEnd w:id="54"/>
@@ -8952,7 +9111,7 @@
       <w:r>
         <w:t xml:space="preserve">O </w:t>
       </w:r>
-      <w:hyperlink r:id="rId38" w:history="1">
+      <w:hyperlink r:id="rId39" w:history="1">
         <w:r>
           <w:rPr>
             <w:rStyle w:val="Hyperlink"/>
@@ -8969,11 +9128,7 @@
       </w:r>
       <w:proofErr w:type="spellEnd"/>
       <w:r>
-        <w:t xml:space="preserve"> de microcontroladores da família ESP, como ESP32 e ESP8266. </w:t>
-      </w:r>
-      <w:r>
-        <w:lastRenderedPageBreak/>
-        <w:t xml:space="preserve">Desenvolvido em </w:t>
+        <w:t xml:space="preserve"> de microcontroladores da família ESP, como ESP32 e ESP8266. Desenvolvido em </w:t>
       </w:r>
       <w:proofErr w:type="spellStart"/>
       <w:r>
@@ -9093,7 +9248,7 @@
                     </pic:cNvPicPr>
                   </pic:nvPicPr>
                   <pic:blipFill>
-                    <a:blip r:embed="rId39" cstate="print">
+                    <a:blip r:embed="rId40" cstate="print">
                       <a:extLst>
                         <a:ext uri="{28A0092B-C50C-407E-A947-70E740481C1C}">
                           <a14:useLocalDpi xmlns:a14="http://schemas.microsoft.com/office/drawing/2010/main" val="0"/>
@@ -9212,7 +9367,7 @@
                     </pic:cNvPicPr>
                   </pic:nvPicPr>
                   <pic:blipFill rotWithShape="1">
-                    <a:blip r:embed="rId40" cstate="print">
+                    <a:blip r:embed="rId41" cstate="print">
                       <a:extLst>
                         <a:ext uri="{28A0092B-C50C-407E-A947-70E740481C1C}">
                           <a14:useLocalDpi xmlns:a14="http://schemas.microsoft.com/office/drawing/2010/main" val="0"/>
@@ -9267,7 +9422,7 @@
       <w:r>
         <w:t xml:space="preserve">O </w:t>
       </w:r>
-      <w:hyperlink r:id="rId41" w:history="1">
+      <w:hyperlink r:id="rId42" w:history="1">
         <w:r>
           <w:rPr>
             <w:rStyle w:val="Hyperlink"/>
@@ -9349,7 +9504,7 @@
                     </pic:cNvPicPr>
                   </pic:nvPicPr>
                   <pic:blipFill>
-                    <a:blip r:embed="rId42" cstate="print">
+                    <a:blip r:embed="rId43" cstate="print">
                       <a:extLst>
                         <a:ext uri="{28A0092B-C50C-407E-A947-70E740481C1C}">
                           <a14:useLocalDpi xmlns:a14="http://schemas.microsoft.com/office/drawing/2010/main" val="0"/>
@@ -9396,7 +9551,7 @@
       <w:proofErr w:type="spellEnd"/>
     </w:p>
     <w:p>
-      <w:hyperlink r:id="rId43" w:history="1">
+      <w:hyperlink r:id="rId44" w:history="1">
         <w:proofErr w:type="spellStart"/>
         <w:r>
           <w:rPr>
@@ -9444,7 +9599,7 @@
                     </pic:cNvPicPr>
                   </pic:nvPicPr>
                   <pic:blipFill>
-                    <a:blip r:embed="rId44">
+                    <a:blip r:embed="rId45">
                       <a:extLst>
                         <a:ext uri="{28A0092B-C50C-407E-A947-70E740481C1C}">
                           <a14:useLocalDpi xmlns:a14="http://schemas.microsoft.com/office/drawing/2010/main" val="0"/>
@@ -9480,8 +9635,8 @@
       <w:pPr>
         <w:pStyle w:val="Heading3"/>
       </w:pPr>
-      <w:bookmarkStart w:id="62" w:name="_Toc229269561"/>
-      <w:bookmarkStart w:id="63" w:name="_Toc229952479"/>
+      <w:bookmarkStart w:id="62" w:name="_Toc229952479"/>
+      <w:bookmarkStart w:id="63" w:name="_Toc229269561"/>
       <w:r>
         <w:lastRenderedPageBreak/>
         <w:t xml:space="preserve">2.3.4 </w:t>
@@ -9489,21 +9644,21 @@
       <w:r>
         <w:t>Servições em nuvem</w:t>
       </w:r>
+      <w:bookmarkEnd w:id="62"/>
+    </w:p>
+    <w:p>
+      <w:pPr>
+        <w:pStyle w:val="Heading4"/>
+      </w:pPr>
+      <w:bookmarkStart w:id="64" w:name="_Toc229952480"/>
+      <w:r>
+        <w:t>GitHub</w:t>
+      </w:r>
       <w:bookmarkEnd w:id="63"/>
-    </w:p>
-    <w:p>
-      <w:pPr>
-        <w:pStyle w:val="Heading4"/>
-      </w:pPr>
-      <w:bookmarkStart w:id="64" w:name="_Toc229952480"/>
-      <w:r>
-        <w:t>GitHub</w:t>
-      </w:r>
-      <w:bookmarkEnd w:id="62"/>
       <w:bookmarkEnd w:id="64"/>
     </w:p>
     <w:p>
-      <w:hyperlink r:id="rId45" w:history="1">
+      <w:hyperlink r:id="rId46" w:history="1">
         <w:r>
           <w:rPr>
             <w:rStyle w:val="Hyperlink"/>
@@ -9549,7 +9704,7 @@
                     </pic:cNvPicPr>
                   </pic:nvPicPr>
                   <pic:blipFill>
-                    <a:blip r:embed="rId46">
+                    <a:blip r:embed="rId47">
                       <a:extLst>
                         <a:ext uri="{28A0092B-C50C-407E-A947-70E740481C1C}">
                           <a14:useLocalDpi xmlns:a14="http://schemas.microsoft.com/office/drawing/2010/main" val="0"/>
@@ -9585,7 +9740,7 @@
     <w:p>
       <w:pPr>
         <w:sectPr>
-          <w:headerReference w:type="default" r:id="rId47"/>
+          <w:headerReference w:type="default" r:id="rId48"/>
           <w:pgSz w:w="11906" w:h="16838"/>
           <w:pgMar w:top="1674" w:right="1701" w:bottom="1417" w:left="1701" w:header="708" w:footer="708" w:gutter="0"/>
           <w:cols w:space="708"/>
@@ -9645,10 +9800,10 @@
                     <pic:cNvPicPr/>
                   </pic:nvPicPr>
                   <pic:blipFill rotWithShape="1">
-                    <a:blip r:embed="rId48">
+                    <a:blip r:embed="rId49">
                       <a:extLst>
                         <a:ext uri="{96DAC541-7B7A-43D3-8B79-37D633B846F1}">
-                          <asvg:svgBlip xmlns:asvg="http://schemas.microsoft.com/office/drawing/2016/SVG/main" r:embed="rId49"/>
+                          <asvg:svgBlip xmlns:asvg="http://schemas.microsoft.com/office/drawing/2016/SVG/main" r:embed="rId50"/>
                         </a:ext>
                       </a:extLst>
                     </a:blip>
@@ -10595,7 +10750,7 @@
                     </pic:cNvPicPr>
                   </pic:nvPicPr>
                   <pic:blipFill rotWithShape="1">
-                    <a:blip r:embed="rId50" cstate="print">
+                    <a:blip r:embed="rId51" cstate="print">
                       <a:extLst>
                         <a:ext uri="{28A0092B-C50C-407E-A947-70E740481C1C}">
                           <a14:useLocalDpi xmlns:a14="http://schemas.microsoft.com/office/drawing/2010/main" val="0"/>
@@ -10724,12 +10879,17 @@
         <w:t xml:space="preserve"> o tempo de forma contínua através da função </w:t>
       </w:r>
       <w:proofErr w:type="spellStart"/>
+      <w:proofErr w:type="gramStart"/>
       <w:r>
         <w:t>millis</w:t>
       </w:r>
       <w:proofErr w:type="spellEnd"/>
       <w:r>
-        <w:t>(), que funciona como um cronômetro interno. Em vez de interromper o processador, o código fica comparando o tempo decorrido com o intervalo desejado de 3 segundos.</w:t>
+        <w:t>(</w:t>
+      </w:r>
+      <w:proofErr w:type="gramEnd"/>
+      <w:r>
+        <w:t>), que funciona como um cronômetro interno. Em vez de interromper o processador, o código fica comparando o tempo decorrido com o intervalo desejado de 3 segundos.</w:t>
       </w:r>
     </w:p>
     <w:p>
@@ -10820,7 +10980,7 @@
                     </pic:cNvPicPr>
                   </pic:nvPicPr>
                   <pic:blipFill rotWithShape="1">
-                    <a:blip r:embed="rId51">
+                    <a:blip r:embed="rId52">
                       <a:extLst>
                         <a:ext uri="{28A0092B-C50C-407E-A947-70E740481C1C}">
                           <a14:useLocalDpi xmlns:a14="http://schemas.microsoft.com/office/drawing/2010/main" val="0"/>
@@ -10890,7 +11050,7 @@
                     <pic:cNvPicPr/>
                   </pic:nvPicPr>
                   <pic:blipFill>
-                    <a:blip r:embed="rId52" cstate="print">
+                    <a:blip r:embed="rId53" cstate="print">
                       <a:extLst>
                         <a:ext uri="{28A0092B-C50C-407E-A947-70E740481C1C}">
                           <a14:useLocalDpi xmlns:a14="http://schemas.microsoft.com/office/drawing/2010/main" val="0"/>
@@ -11177,7 +11337,7 @@
                     </pic:cNvPicPr>
                   </pic:nvPicPr>
                   <pic:blipFill rotWithShape="1">
-                    <a:blip r:embed="rId53" cstate="print">
+                    <a:blip r:embed="rId54" cstate="print">
                       <a:extLst>
                         <a:ext uri="{28A0092B-C50C-407E-A947-70E740481C1C}">
                           <a14:useLocalDpi xmlns:a14="http://schemas.microsoft.com/office/drawing/2010/main" val="0"/>
@@ -11292,7 +11452,7 @@
                     <pic:cNvPicPr/>
                   </pic:nvPicPr>
                   <pic:blipFill rotWithShape="1">
-                    <a:blip r:embed="rId54">
+                    <a:blip r:embed="rId55">
                       <a:extLst>
                         <a:ext uri="{28A0092B-C50C-407E-A947-70E740481C1C}">
                           <a14:useLocalDpi xmlns:a14="http://schemas.microsoft.com/office/drawing/2010/main" val="0"/>
@@ -11382,7 +11542,7 @@
           <w:noProof/>
         </w:rPr>
         <w:drawing>
-          <wp:inline distT="0" distB="0" distL="0" distR="0" wp14:anchorId="5028E2AF" wp14:editId="1876948C">
+          <wp:inline distT="0" distB="0" distL="0" distR="0" wp14:anchorId="5028E2AF" wp14:editId="43544A8D">
             <wp:extent cx="3378835" cy="1213485"/>
             <wp:effectExtent l="19050" t="19050" r="0" b="5715"/>
             <wp:docPr id="471537322" name="Picture 3"/>
@@ -11399,7 +11559,7 @@
                     </pic:cNvPicPr>
                   </pic:nvPicPr>
                   <pic:blipFill rotWithShape="1">
-                    <a:blip r:embed="rId55" cstate="print">
+                    <a:blip r:embed="rId56" cstate="print">
                       <a:extLst>
                         <a:ext uri="{28A0092B-C50C-407E-A947-70E740481C1C}">
                           <a14:useLocalDpi xmlns:a14="http://schemas.microsoft.com/office/drawing/2010/main" val="0"/>
@@ -11463,7 +11623,7 @@
                     <pic:cNvPicPr/>
                   </pic:nvPicPr>
                   <pic:blipFill>
-                    <a:blip r:embed="rId56" cstate="print">
+                    <a:blip r:embed="rId57" cstate="print">
                       <a:extLst>
                         <a:ext uri="{28A0092B-C50C-407E-A947-70E740481C1C}">
                           <a14:useLocalDpi xmlns:a14="http://schemas.microsoft.com/office/drawing/2010/main" val="0"/>
@@ -11519,14 +11679,833 @@
     </w:p>
     <w:p>
       <w:pPr>
-        <w:pStyle w:val="Heading3"/>
-      </w:pPr>
+        <w:pStyle w:val="Heading4"/>
+      </w:pPr>
+      <w:r>
+        <w:lastRenderedPageBreak/>
+        <w:t>Teste #3</w:t>
+      </w:r>
+    </w:p>
+    <w:p>
+      <w:pPr>
+        <w:pStyle w:val="Heading5"/>
+      </w:pPr>
+      <w:r>
+        <w:t>Bibliotecas utilizadas</w:t>
+      </w:r>
+    </w:p>
+    <w:p>
+      <w:pPr>
+        <w:pStyle w:val="ListParagraph"/>
+        <w:numPr>
+          <w:ilvl w:val="0"/>
+          <w:numId w:val="44"/>
+        </w:numPr>
+        <w:rPr>
+          <w:lang w:val="en-GB"/>
+        </w:rPr>
+      </w:pPr>
+      <w:r>
+        <w:t xml:space="preserve"> </w:t>
+      </w:r>
+      <w:proofErr w:type="spellStart"/>
+      <w:r>
+        <w:rPr>
+          <w:lang w:val="en-GB"/>
+        </w:rPr>
+        <w:t>WiFi</w:t>
+      </w:r>
+      <w:proofErr w:type="spellEnd"/>
+    </w:p>
+    <w:p>
+      <w:pPr>
+        <w:pStyle w:val="ListParagraph"/>
+        <w:numPr>
+          <w:ilvl w:val="0"/>
+          <w:numId w:val="44"/>
+        </w:numPr>
+        <w:rPr>
+          <w:lang w:val="en-GB"/>
+        </w:rPr>
+      </w:pPr>
+      <w:r>
+        <w:rPr>
+          <w:lang w:val="en-GB"/>
+        </w:rPr>
+        <w:t xml:space="preserve"> </w:t>
+      </w:r>
+      <w:proofErr w:type="spellStart"/>
+      <w:r>
+        <w:rPr>
+          <w:lang w:val="en-GB"/>
+        </w:rPr>
+        <w:t>WebServer</w:t>
+      </w:r>
+      <w:proofErr w:type="spellEnd"/>
+    </w:p>
+    <w:p>
+      <w:pPr>
+        <w:pStyle w:val="ListParagraph"/>
+        <w:numPr>
+          <w:ilvl w:val="1"/>
+          <w:numId w:val="44"/>
+        </w:numPr>
+      </w:pPr>
+      <w:r>
+        <w:t>Para fazer uma página d</w:t>
+      </w:r>
+      <w:r>
+        <w:t>a web</w:t>
+      </w:r>
+    </w:p>
+    <w:p>
+      <w:pPr>
+        <w:pStyle w:val="Heading5"/>
+      </w:pPr>
+      <w:r>
+        <w:t>Montagem física</w:t>
+      </w:r>
+    </w:p>
+    <w:p>
+      <w:pPr>
+        <w:pStyle w:val="ListParagraph"/>
+        <w:numPr>
+          <w:ilvl w:val="0"/>
+          <w:numId w:val="45"/>
+        </w:numPr>
+      </w:pPr>
+      <w:r>
+        <w:t xml:space="preserve">4x motor 1400KV </w:t>
+      </w:r>
+    </w:p>
+    <w:p>
+      <w:pPr>
+        <w:pStyle w:val="ListParagraph"/>
+        <w:numPr>
+          <w:ilvl w:val="0"/>
+          <w:numId w:val="45"/>
+        </w:numPr>
+      </w:pPr>
+      <w:r>
+        <w:t>4x ESC</w:t>
+      </w:r>
+    </w:p>
+    <w:p>
+      <w:pPr>
+        <w:pStyle w:val="ListParagraph"/>
+        <w:numPr>
+          <w:ilvl w:val="0"/>
+          <w:numId w:val="45"/>
+        </w:numPr>
+      </w:pPr>
+      <w:r>
+        <w:t>1x bateria 2200mAh 3S</w:t>
+      </w:r>
+    </w:p>
+    <w:p>
+      <w:pPr>
+        <w:pStyle w:val="ListParagraph"/>
+        <w:numPr>
+          <w:ilvl w:val="0"/>
+          <w:numId w:val="45"/>
+        </w:numPr>
+      </w:pPr>
+      <w:r>
+        <w:t xml:space="preserve">1x </w:t>
+      </w:r>
+    </w:p>
+    <w:p>
+      <w:pPr>
+        <w:pStyle w:val="ListParagraph"/>
+        <w:numPr>
+          <w:ilvl w:val="0"/>
+          <w:numId w:val="45"/>
+        </w:numPr>
+      </w:pPr>
+      <w:r>
+        <w:t xml:space="preserve">1x antena de </w:t>
+      </w:r>
+      <w:proofErr w:type="spellStart"/>
+      <w:r>
+        <w:t>wifi</w:t>
+      </w:r>
+      <w:proofErr w:type="spellEnd"/>
+    </w:p>
+    <w:p>
+      <w:pPr>
+        <w:pStyle w:val="ListParagraph"/>
+        <w:numPr>
+          <w:ilvl w:val="0"/>
+          <w:numId w:val="45"/>
+        </w:numPr>
+      </w:pPr>
+      <w:r>
+        <w:t>1x ESP32</w:t>
+      </w:r>
+    </w:p>
+    <w:p>
+      <w:pPr>
+        <w:pStyle w:val="ListParagraph"/>
+        <w:numPr>
+          <w:ilvl w:val="0"/>
+          <w:numId w:val="45"/>
+        </w:numPr>
+      </w:pPr>
+      <w:r>
+        <w:t>1x Placa de ensaio ESP32</w:t>
+      </w:r>
+    </w:p>
+    <w:p>
+      <w:pPr>
+        <w:pStyle w:val="ListParagraph"/>
+        <w:numPr>
+          <w:ilvl w:val="1"/>
+          <w:numId w:val="45"/>
+        </w:numPr>
+      </w:pPr>
+      <w:r>
+        <w:t>Para parafusar na mesa</w:t>
+      </w:r>
+    </w:p>
+    <w:p>
+      <w:pPr>
+        <w:pStyle w:val="ListParagraph"/>
+        <w:numPr>
+          <w:ilvl w:val="0"/>
+          <w:numId w:val="45"/>
+        </w:numPr>
+      </w:pPr>
+      <w:r>
+        <w:t>6x cabos MM</w:t>
+      </w:r>
+      <w:r>
+        <w:t xml:space="preserve"> </w:t>
+      </w:r>
+    </w:p>
+    <w:p>
+      <w:pPr>
+        <w:pStyle w:val="ListParagraph"/>
+        <w:numPr>
+          <w:ilvl w:val="1"/>
+          <w:numId w:val="45"/>
+        </w:numPr>
+      </w:pPr>
+      <w:r>
+        <w:t>Cortei um para usar na placa de ensaio</w:t>
+      </w:r>
+    </w:p>
+    <w:p>
+      <w:pPr>
+        <w:jc w:val="center"/>
+      </w:pPr>
+      <w:r>
+        <w:rPr>
+          <w:noProof/>
+        </w:rPr>
+        <w:drawing>
+          <wp:inline distT="0" distB="0" distL="0" distR="0" wp14:anchorId="3E8B9505" wp14:editId="3BD7816A">
+            <wp:extent cx="3086100" cy="3549016"/>
+            <wp:effectExtent l="0" t="0" r="0" b="0"/>
+            <wp:docPr id="1490381025" name="Picture 1"/>
+            <wp:cNvGraphicFramePr>
+              <a:graphicFrameLocks xmlns:a="http://schemas.openxmlformats.org/drawingml/2006/main" noChangeAspect="1"/>
+            </wp:cNvGraphicFramePr>
+            <a:graphic xmlns:a="http://schemas.openxmlformats.org/drawingml/2006/main">
+              <a:graphicData uri="http://schemas.openxmlformats.org/drawingml/2006/picture">
+                <pic:pic xmlns:pic="http://schemas.openxmlformats.org/drawingml/2006/picture">
+                  <pic:nvPicPr>
+                    <pic:cNvPr id="0" name="Picture 1"/>
+                    <pic:cNvPicPr>
+                      <a:picLocks noChangeAspect="1" noChangeArrowheads="1"/>
+                    </pic:cNvPicPr>
+                  </pic:nvPicPr>
+                  <pic:blipFill rotWithShape="1">
+                    <a:blip r:embed="rId58" cstate="print">
+                      <a:extLst>
+                        <a:ext uri="{28A0092B-C50C-407E-A947-70E740481C1C}">
+                          <a14:useLocalDpi xmlns:a14="http://schemas.microsoft.com/office/drawing/2010/main" val="0"/>
+                        </a:ext>
+                      </a:extLst>
+                    </a:blip>
+                    <a:srcRect l="5300" t="21941" r="20495" b="13830"/>
+                    <a:stretch>
+                      <a:fillRect/>
+                    </a:stretch>
+                  </pic:blipFill>
+                  <pic:spPr bwMode="auto">
+                    <a:xfrm>
+                      <a:off x="0" y="0"/>
+                      <a:ext cx="3087070" cy="3550132"/>
+                    </a:xfrm>
+                    <a:prstGeom prst="rect">
+                      <a:avLst/>
+                    </a:prstGeom>
+                    <a:noFill/>
+                    <a:ln>
+                      <a:noFill/>
+                    </a:ln>
+                    <a:extLst>
+                      <a:ext uri="{53640926-AAD7-44D8-BBD7-CCE9431645EC}">
+                        <a14:shadowObscured xmlns:a14="http://schemas.microsoft.com/office/drawing/2010/main"/>
+                      </a:ext>
+                    </a:extLst>
+                  </pic:spPr>
+                </pic:pic>
+              </a:graphicData>
+            </a:graphic>
+          </wp:inline>
+        </w:drawing>
+      </w:r>
+    </w:p>
+    <w:p>
+      <w:pPr>
+        <w:spacing w:after="200" w:line="276" w:lineRule="auto"/>
+        <w:jc w:val="left"/>
+      </w:pPr>
+      <w:r>
+        <w:br w:type="page"/>
+      </w:r>
+    </w:p>
+    <w:p>
+      <w:pPr>
+        <w:pStyle w:val="Heading5"/>
+      </w:pPr>
+      <w:r>
+        <w:lastRenderedPageBreak/>
+        <w:t xml:space="preserve">Explicação </w:t>
+      </w:r>
+      <w:r>
+        <w:t>e problemas</w:t>
+      </w:r>
+    </w:p>
+    <w:p>
+      <w:pPr>
+        <w:spacing w:after="200" w:line="276" w:lineRule="auto"/>
+        <w:jc w:val="left"/>
+      </w:pPr>
+      <w:r>
+        <w:t>O objetivo principal desse teste é conseguir rotacionar os 4 motores de forma livre, tanto em conjunto quanto em separado, logo no começo tive dificuldade com as bibliotecas:</w:t>
+      </w:r>
+    </w:p>
+    <w:p>
+      <w:pPr>
+        <w:pStyle w:val="Heading6"/>
+      </w:pPr>
+      <w:r>
+        <w:t>ServoESP32</w:t>
+      </w:r>
+    </w:p>
+    <w:p>
+      <w:r>
+        <w:t>Apresentou obsolescência de código, resultando em falhas fatais de compilação por utilizar funções de PWM descontinuadas nas versões atuais do Core do ESP32.</w:t>
+      </w:r>
+    </w:p>
+    <w:p>
+      <w:pPr>
+        <w:pStyle w:val="Heading6"/>
+      </w:pPr>
+      <w:r>
+        <w:t>ServoESP32Fix</w:t>
+      </w:r>
+    </w:p>
+    <w:p>
+      <w:r>
+        <w:t>Embora projetada como uma correção da biblioteca anterior, também se mostrou desatualizada frente às novas diretrizes do compilador da IDE, impedindo a geração do arquivo binário.</w:t>
+      </w:r>
+    </w:p>
+    <w:p>
+      <w:pPr>
+        <w:pStyle w:val="Heading6"/>
+      </w:pPr>
+      <w:r>
+        <w:t>ESP32Servo</w:t>
+      </w:r>
+    </w:p>
+    <w:p>
       <w:bookmarkStart w:id="122" w:name="_Toc193126148"/>
       <w:bookmarkStart w:id="123" w:name="_Toc193674341"/>
       <w:bookmarkStart w:id="124" w:name="_Toc229269574"/>
       <w:bookmarkStart w:id="125" w:name="_Toc229952504"/>
       <w:r>
+        <w:t>Apesar de concluir a compilação com sucesso, gerou um erro crítico de interferência cruzada por software. Durante a execução, o acionamento lógico do canal do Motor 1 ativava simultaneamente o Motor 2 de forma errática. O mesmo comportamento de espelhamento de sinal foi observado entre os canais dos Motores 3 e 4, inviabilizando o controle isolado do sistema."</w:t>
+      </w:r>
+    </w:p>
+    <w:p>
+      <w:pPr>
+        <w:pStyle w:val="Heading6"/>
+      </w:pPr>
+      <w:r>
+        <w:t>Solução</w:t>
+      </w:r>
+    </w:p>
+    <w:p>
+      <w:r>
+        <w:t>Antes de tudo,</w:t>
+      </w:r>
+      <w:r>
+        <w:t xml:space="preserve"> consultei a </w:t>
+      </w:r>
+      <w:proofErr w:type="spellStart"/>
+      <w:r>
+        <w:t>datasheet</w:t>
+      </w:r>
+      <w:proofErr w:type="spellEnd"/>
+      <w:r>
+        <w:t xml:space="preserve"> e</w:t>
+      </w:r>
+      <w:r>
+        <w:t xml:space="preserve"> troquei os pinos para mais de</w:t>
+      </w:r>
+      <w:r>
+        <w:t xml:space="preserve"> 3 combinações diferentes:</w:t>
+      </w:r>
+    </w:p>
+    <w:p>
+      <w:pPr>
+        <w:pStyle w:val="ListParagraph"/>
+        <w:numPr>
+          <w:ilvl w:val="0"/>
+          <w:numId w:val="48"/>
+        </w:numPr>
+      </w:pPr>
+      <w:r>
+        <w:t>(4,5,6,7)</w:t>
+      </w:r>
+      <w:r>
+        <w:t xml:space="preserve">, </w:t>
+      </w:r>
+    </w:p>
+    <w:p>
+      <w:pPr>
+        <w:pStyle w:val="ListParagraph"/>
+        <w:numPr>
+          <w:ilvl w:val="0"/>
+          <w:numId w:val="48"/>
+        </w:numPr>
+      </w:pPr>
+      <w:r>
+        <w:t>(39,40,41,42)</w:t>
+      </w:r>
+    </w:p>
+    <w:p>
+      <w:pPr>
+        <w:pStyle w:val="ListParagraph"/>
+        <w:numPr>
+          <w:ilvl w:val="0"/>
+          <w:numId w:val="48"/>
+        </w:numPr>
+      </w:pPr>
+      <w:r>
+        <w:t>(10,11,12,13)</w:t>
+      </w:r>
+    </w:p>
+    <w:p>
+      <w:r>
+        <w:t>Acabei por</w:t>
+      </w:r>
+      <w:r>
+        <w:t xml:space="preserve"> segui</w:t>
+      </w:r>
+      <w:r>
+        <w:t>r</w:t>
+      </w:r>
+      <w:r>
+        <w:t xml:space="preserve"> com a</w:t>
+      </w:r>
+      <w:r>
+        <w:t xml:space="preserve"> eliminação de pacotes externos</w:t>
+      </w:r>
+      <w:r>
+        <w:t>, que</w:t>
+      </w:r>
+      <w:r>
+        <w:t xml:space="preserve"> permitiu configurar o </w:t>
+      </w:r>
+      <w:r>
+        <w:rPr>
+          <w:b/>
+          <w:bCs/>
+        </w:rPr>
+        <w:t xml:space="preserve">LEDC (LED </w:t>
+      </w:r>
+      <w:proofErr w:type="spellStart"/>
+      <w:r>
+        <w:rPr>
+          <w:b/>
+          <w:bCs/>
+        </w:rPr>
+        <w:t>Control</w:t>
+      </w:r>
+      <w:proofErr w:type="spellEnd"/>
+      <w:r>
+        <w:rPr>
+          <w:b/>
+          <w:bCs/>
+        </w:rPr>
+        <w:t>)</w:t>
+      </w:r>
+      <w:r>
+        <w:t xml:space="preserve"> do ESP32 em sua capacidade máxima e de forma totalmente isolada. A escolha técnica justifica-se pelos seguintes fatores de engenharia:</w:t>
+      </w:r>
+    </w:p>
+    <w:p>
+      <w:pPr>
+        <w:numPr>
+          <w:ilvl w:val="0"/>
+          <w:numId w:val="47"/>
+        </w:numPr>
+      </w:pPr>
+      <w:r>
+        <w:rPr>
+          <w:b/>
+          <w:bCs/>
+        </w:rPr>
+        <w:t>Isolamento Absoluto por Hardware:</w:t>
+      </w:r>
+      <w:r>
+        <w:t xml:space="preserve"> O uso direto da função do fabricante </w:t>
+      </w:r>
+      <w:proofErr w:type="spellStart"/>
+      <w:proofErr w:type="gramStart"/>
+      <w:r>
+        <w:t>ledcAttach</w:t>
+      </w:r>
+      <w:proofErr w:type="spellEnd"/>
+      <w:r>
+        <w:t>(</w:t>
+      </w:r>
+      <w:proofErr w:type="gramEnd"/>
+      <w:r>
+        <w:t xml:space="preserve">) garante que o sistema operacional aloque, em nível de silício, canais periféricos e temporizadores físicos totalmente independentes para cada pino. Como cada GPIO possui seu próprio </w:t>
+      </w:r>
+      <w:r>
         <w:lastRenderedPageBreak/>
+        <w:t>gerador de onda dedicado, tornou-se fisicamente impossível ocorrer o efeito de espelhamento ou vazamento de sinal entre os motores.</w:t>
+      </w:r>
+    </w:p>
+    <w:p>
+      <w:pPr>
+        <w:numPr>
+          <w:ilvl w:val="0"/>
+          <w:numId w:val="47"/>
+        </w:numPr>
+      </w:pPr>
+      <w:r>
+        <w:rPr>
+          <w:b/>
+          <w:bCs/>
+        </w:rPr>
+        <w:t>Ganho de Resolução Dinâmica:</w:t>
+      </w:r>
+      <w:r>
+        <w:t xml:space="preserve"> Enquanto </w:t>
+      </w:r>
+      <w:r>
+        <w:t xml:space="preserve">as </w:t>
+      </w:r>
+      <w:r>
+        <w:t>bibliotecas operam com r 10 bits</w:t>
+      </w:r>
+      <w:r>
+        <w:t xml:space="preserve"> de resolução</w:t>
+      </w:r>
+      <w:r>
+        <w:t xml:space="preserve">, a programação direta permitiu configurar o sistema com </w:t>
+      </w:r>
+      <w:r>
+        <w:rPr>
+          <w:b/>
+          <w:bCs/>
+        </w:rPr>
+        <w:t>14 bits de resolução</w:t>
+      </w:r>
+      <w:r>
+        <w:t xml:space="preserve">. Isso divide o ciclo de trabalho em uma escala matemática de até 16.383 níveis discretos </w:t>
+      </w:r>
+      <w:r>
+        <w:t>(</w:t>
+      </w:r>
+      <m:oMath>
+        <m:r>
+          <w:rPr>
+            <w:rFonts w:ascii="Cambria Math" w:hAnsi="Cambria Math"/>
+          </w:rPr>
+          <m:t>2¹⁴</m:t>
+        </m:r>
+      </m:oMath>
+      <w:r>
+        <w:t>)</w:t>
+      </w:r>
+      <w:r>
+        <w:t>fornecendo uma precisão muito superior no ajuste fino da rotação dos motores.</w:t>
+      </w:r>
+    </w:p>
+    <w:p>
+      <w:pPr>
+        <w:numPr>
+          <w:ilvl w:val="0"/>
+          <w:numId w:val="47"/>
+        </w:numPr>
+      </w:pPr>
+      <w:r>
+        <w:rPr>
+          <w:b/>
+          <w:bCs/>
+        </w:rPr>
+        <w:t>Precisão Matemática no Ciclo de Trabalho (</w:t>
+      </w:r>
+      <w:proofErr w:type="spellStart"/>
+      <w:r>
+        <w:rPr>
+          <w:b/>
+          <w:bCs/>
+        </w:rPr>
+        <w:t>Duty</w:t>
+      </w:r>
+      <w:proofErr w:type="spellEnd"/>
+      <w:r>
+        <w:rPr>
+          <w:b/>
+          <w:bCs/>
+        </w:rPr>
+        <w:t xml:space="preserve"> </w:t>
+      </w:r>
+      <w:proofErr w:type="spellStart"/>
+      <w:r>
+        <w:rPr>
+          <w:b/>
+          <w:bCs/>
+        </w:rPr>
+        <w:t>Cycle</w:t>
+      </w:r>
+      <w:proofErr w:type="spellEnd"/>
+      <w:r>
+        <w:rPr>
+          <w:b/>
+          <w:bCs/>
+        </w:rPr>
+        <w:t>):</w:t>
+      </w:r>
+      <w:r>
+        <w:t xml:space="preserve"> Controladores eletrônicos de velocidade (</w:t>
+      </w:r>
+      <w:proofErr w:type="spellStart"/>
+      <w:r>
+        <w:t>ESCs</w:t>
+      </w:r>
+      <w:proofErr w:type="spellEnd"/>
+      <w:r>
+        <w:t>) de modelismo operam em uma frequência base de 50Hz, o que significa que o período total de uma oscilação é de exatamente 20.000</w:t>
+      </w:r>
+      <w:r>
+        <w:rPr>
+          <w:rFonts w:cs="Arial"/>
+        </w:rPr>
+        <w:t>µ</w:t>
+      </w:r>
+      <w:r>
+        <w:t>s</w:t>
+      </w:r>
+      <w:r>
+        <w:t>. O cálculo do tempo de condução que transita entre o estado parado 1000</w:t>
+      </w:r>
+      <w:r>
+        <w:rPr>
+          <w:rFonts w:cs="Arial"/>
+        </w:rPr>
+        <w:t>µ</w:t>
+      </w:r>
+      <w:r>
+        <w:t>s</w:t>
+      </w:r>
+      <w:r>
+        <w:t xml:space="preserve"> e a rotação de ensaio 118</w:t>
+      </w:r>
+      <w:r>
+        <w:t>0</w:t>
+      </w:r>
+      <w:r>
+        <w:rPr>
+          <w:rFonts w:cs="Arial"/>
+        </w:rPr>
+        <w:t>µ</w:t>
+      </w:r>
+      <w:r>
+        <w:t>s</w:t>
+      </w:r>
+      <w:r>
+        <w:t xml:space="preserve"> é processado em tempo real na raiz da CPU por meio da equação de mapeamento direto:</w:t>
+      </w:r>
+    </w:p>
+    <w:p>
+      <w:pPr>
+        <w:numPr>
+          <w:ilvl w:val="0"/>
+          <w:numId w:val="47"/>
+        </w:numPr>
+        <w:jc w:val="center"/>
+      </w:pPr>
+      <w:proofErr w:type="spellStart"/>
+      <m:oMath>
+        <m:r>
+          <m:rPr>
+            <m:nor/>
+          </m:rPr>
+          <w:rPr>
+            <w:rFonts w:ascii="Cambria Math" w:hAnsi="Cambria Math"/>
+          </w:rPr>
+          <m:t>Duty</m:t>
+        </m:r>
+        <w:proofErr w:type="spellEnd"/>
+        <m:r>
+          <w:rPr>
+            <w:rFonts w:ascii="Cambria Math" w:hAnsi="Cambria Math"/>
+          </w:rPr>
+          <m:t>=</m:t>
+        </m:r>
+        <m:f>
+          <m:fPr>
+            <m:ctrlPr>
+              <w:rPr>
+                <w:rFonts w:ascii="Cambria Math" w:hAnsi="Cambria Math"/>
+                <w:i/>
+              </w:rPr>
+            </m:ctrlPr>
+          </m:fPr>
+          <m:num>
+            <m:d>
+              <m:dPr>
+                <m:ctrlPr>
+                  <w:rPr>
+                    <w:rFonts w:ascii="Cambria Math" w:hAnsi="Cambria Math"/>
+                    <w:i/>
+                  </w:rPr>
+                </m:ctrlPr>
+              </m:dPr>
+              <m:e>
+                <m:r>
+                  <m:rPr>
+                    <m:nor/>
+                  </m:rPr>
+                  <w:rPr>
+                    <w:rFonts w:ascii="Cambria Math" w:hAnsi="Cambria Math"/>
+                  </w:rPr>
+                  <m:t xml:space="preserve">Microsegundos </m:t>
+                </m:r>
+                <m:r>
+                  <w:rPr>
+                    <w:rFonts w:ascii="Cambria Math" w:hAnsi="Cambria Math"/>
+                  </w:rPr>
+                  <m:t>* 16383</m:t>
+                </m:r>
+              </m:e>
+            </m:d>
+          </m:num>
+          <m:den>
+            <m:r>
+              <w:rPr>
+                <w:rFonts w:ascii="Cambria Math" w:hAnsi="Cambria Math"/>
+              </w:rPr>
+              <m:t>20000</m:t>
+            </m:r>
+          </m:den>
+        </m:f>
+      </m:oMath>
+    </w:p>
+    <w:p>
+      <w:pPr>
+        <w:pStyle w:val="ListParagraph"/>
+        <w:spacing w:after="200" w:line="276" w:lineRule="auto"/>
+        <w:jc w:val="center"/>
+      </w:pPr>
+      <w:r>
+        <w:rPr>
+          <w:noProof/>
+        </w:rPr>
+        <w:drawing>
+          <wp:inline distT="0" distB="0" distL="0" distR="0" wp14:anchorId="4AF5780F" wp14:editId="085F1925">
+            <wp:extent cx="2742581" cy="2895600"/>
+            <wp:effectExtent l="95250" t="95250" r="76835" b="76200"/>
+            <wp:docPr id="1401995615" name="Picture 1"/>
+            <wp:cNvGraphicFramePr>
+              <a:graphicFrameLocks xmlns:a="http://schemas.openxmlformats.org/drawingml/2006/main" noChangeAspect="1"/>
+            </wp:cNvGraphicFramePr>
+            <a:graphic xmlns:a="http://schemas.openxmlformats.org/drawingml/2006/main">
+              <a:graphicData uri="http://schemas.openxmlformats.org/drawingml/2006/picture">
+                <pic:pic xmlns:pic="http://schemas.openxmlformats.org/drawingml/2006/picture">
+                  <pic:nvPicPr>
+                    <pic:cNvPr id="0" name="Picture 1"/>
+                    <pic:cNvPicPr>
+                      <a:picLocks noChangeAspect="1" noChangeArrowheads="1"/>
+                    </pic:cNvPicPr>
+                  </pic:nvPicPr>
+                  <pic:blipFill rotWithShape="1">
+                    <a:blip r:embed="rId59" cstate="print">
+                      <a:extLst>
+                        <a:ext uri="{28A0092B-C50C-407E-A947-70E740481C1C}">
+                          <a14:useLocalDpi xmlns:a14="http://schemas.microsoft.com/office/drawing/2010/main" val="0"/>
+                        </a:ext>
+                      </a:extLst>
+                    </a:blip>
+                    <a:srcRect l="29328" t="4833" r="29507" b="3719"/>
+                    <a:stretch>
+                      <a:fillRect/>
+                    </a:stretch>
+                  </pic:blipFill>
+                  <pic:spPr bwMode="auto">
+                    <a:xfrm>
+                      <a:off x="0" y="0"/>
+                      <a:ext cx="2746678" cy="2899926"/>
+                    </a:xfrm>
+                    <a:prstGeom prst="roundRect">
+                      <a:avLst>
+                        <a:gd name="adj" fmla="val 4167"/>
+                      </a:avLst>
+                    </a:prstGeom>
+                    <a:solidFill>
+                      <a:srgbClr val="FFFFFF"/>
+                    </a:solidFill>
+                    <a:ln w="76200" cap="sq">
+                      <a:solidFill>
+                        <a:srgbClr val="EAEAEA"/>
+                      </a:solidFill>
+                      <a:miter lim="800000"/>
+                    </a:ln>
+                    <a:effectLst/>
+                    <a:scene3d>
+                      <a:camera prst="orthographicFront"/>
+                      <a:lightRig rig="threePt" dir="t">
+                        <a:rot lat="0" lon="0" rev="2700000"/>
+                      </a:lightRig>
+                    </a:scene3d>
+                    <a:sp3d contourW="6350">
+                      <a:contourClr>
+                        <a:srgbClr val="C0C0C0"/>
+                      </a:contourClr>
+                    </a:sp3d>
+                    <a:extLst>
+                      <a:ext uri="{53640926-AAD7-44D8-BBD7-CCE9431645EC}">
+                        <a14:shadowObscured xmlns:a14="http://schemas.microsoft.com/office/drawing/2010/main"/>
+                      </a:ext>
+                    </a:extLst>
+                  </pic:spPr>
+                </pic:pic>
+              </a:graphicData>
+            </a:graphic>
+          </wp:inline>
+        </w:drawing>
+      </w:r>
+    </w:p>
+    <w:p>
+      <w:pPr>
+        <w:jc w:val="center"/>
+      </w:pPr>
+    </w:p>
+    <w:p>
+      <w:pPr>
+        <w:pStyle w:val="Heading3"/>
+      </w:pPr>
+      <w:r>
         <w:t>2.</w:t>
       </w:r>
       <w:r>
@@ -11570,6 +12549,7 @@
       <w:bookmarkStart w:id="130" w:name="_Toc229269576"/>
       <w:bookmarkStart w:id="131" w:name="_Toc229952506"/>
       <w:r>
+        <w:lastRenderedPageBreak/>
         <w:t xml:space="preserve">Histórico de </w:t>
       </w:r>
       <w:proofErr w:type="spellStart"/>
@@ -11591,7 +12571,15 @@
         <w:jc w:val="left"/>
       </w:pPr>
       <w:r>
-        <w:t xml:space="preserve">Dei um  total de x </w:t>
+        <w:t xml:space="preserve">Dei </w:t>
+      </w:r>
+      <w:proofErr w:type="gramStart"/>
+      <w:r>
+        <w:t>um  total</w:t>
+      </w:r>
+      <w:proofErr w:type="gramEnd"/>
+      <w:r>
+        <w:t xml:space="preserve"> de x </w:t>
       </w:r>
       <w:proofErr w:type="spellStart"/>
       <w:r>
@@ -11790,7 +12778,7 @@
         <w:spacing w:after="200" w:line="276" w:lineRule="auto"/>
         <w:jc w:val="left"/>
         <w:sectPr>
-          <w:headerReference w:type="default" r:id="rId57"/>
+          <w:headerReference w:type="default" r:id="rId60"/>
           <w:pgSz w:w="11906" w:h="16838"/>
           <w:pgMar w:top="1674" w:right="1701" w:bottom="1417" w:left="1701" w:header="708" w:footer="708" w:gutter="0"/>
           <w:cols w:space="708"/>
@@ -11800,7 +12788,7 @@
     </w:p>
     <w:p/>
     <w:sectPr>
-      <w:headerReference w:type="default" r:id="rId58"/>
+      <w:headerReference w:type="default" r:id="rId61"/>
       <w:pgSz w:w="11906" w:h="16838"/>
       <w:pgMar w:top="1417" w:right="1701" w:bottom="1417" w:left="1701" w:header="708" w:footer="708" w:gutter="0"/>
       <w:cols w:space="708"/>
@@ -14441,6 +15429,119 @@
     </w:lvl>
   </w:abstractNum>
   <w:abstractNum w:abstractNumId="9" w15:restartNumberingAfterBreak="0">
+    <w:nsid w:val="109609F8"/>
+    <w:multiLevelType w:val="hybridMultilevel"/>
+    <w:tmpl w:val="5B3C7B52"/>
+    <w:lvl w:ilvl="0" w:tplc="08090001">
+      <w:start w:val="1"/>
+      <w:numFmt w:val="bullet"/>
+      <w:lvlText w:val=""/>
+      <w:lvlJc w:val="left"/>
+      <w:pPr>
+        <w:ind w:left="720" w:hanging="360"/>
+      </w:pPr>
+      <w:rPr>
+        <w:rFonts w:ascii="Symbol" w:hAnsi="Symbol" w:hint="default"/>
+      </w:rPr>
+    </w:lvl>
+    <w:lvl w:ilvl="1" w:tplc="08090003" w:tentative="1">
+      <w:start w:val="1"/>
+      <w:numFmt w:val="bullet"/>
+      <w:lvlText w:val="o"/>
+      <w:lvlJc w:val="left"/>
+      <w:pPr>
+        <w:ind w:left="1440" w:hanging="360"/>
+      </w:pPr>
+      <w:rPr>
+        <w:rFonts w:ascii="Courier New" w:hAnsi="Courier New" w:cs="Courier New" w:hint="default"/>
+      </w:rPr>
+    </w:lvl>
+    <w:lvl w:ilvl="2" w:tplc="08090005" w:tentative="1">
+      <w:start w:val="1"/>
+      <w:numFmt w:val="bullet"/>
+      <w:lvlText w:val=""/>
+      <w:lvlJc w:val="left"/>
+      <w:pPr>
+        <w:ind w:left="2160" w:hanging="360"/>
+      </w:pPr>
+      <w:rPr>
+        <w:rFonts w:ascii="Wingdings" w:hAnsi="Wingdings" w:hint="default"/>
+      </w:rPr>
+    </w:lvl>
+    <w:lvl w:ilvl="3" w:tplc="08090001" w:tentative="1">
+      <w:start w:val="1"/>
+      <w:numFmt w:val="bullet"/>
+      <w:lvlText w:val=""/>
+      <w:lvlJc w:val="left"/>
+      <w:pPr>
+        <w:ind w:left="2880" w:hanging="360"/>
+      </w:pPr>
+      <w:rPr>
+        <w:rFonts w:ascii="Symbol" w:hAnsi="Symbol" w:hint="default"/>
+      </w:rPr>
+    </w:lvl>
+    <w:lvl w:ilvl="4" w:tplc="08090003" w:tentative="1">
+      <w:start w:val="1"/>
+      <w:numFmt w:val="bullet"/>
+      <w:lvlText w:val="o"/>
+      <w:lvlJc w:val="left"/>
+      <w:pPr>
+        <w:ind w:left="3600" w:hanging="360"/>
+      </w:pPr>
+      <w:rPr>
+        <w:rFonts w:ascii="Courier New" w:hAnsi="Courier New" w:cs="Courier New" w:hint="default"/>
+      </w:rPr>
+    </w:lvl>
+    <w:lvl w:ilvl="5" w:tplc="08090005" w:tentative="1">
+      <w:start w:val="1"/>
+      <w:numFmt w:val="bullet"/>
+      <w:lvlText w:val=""/>
+      <w:lvlJc w:val="left"/>
+      <w:pPr>
+        <w:ind w:left="4320" w:hanging="360"/>
+      </w:pPr>
+      <w:rPr>
+        <w:rFonts w:ascii="Wingdings" w:hAnsi="Wingdings" w:hint="default"/>
+      </w:rPr>
+    </w:lvl>
+    <w:lvl w:ilvl="6" w:tplc="08090001" w:tentative="1">
+      <w:start w:val="1"/>
+      <w:numFmt w:val="bullet"/>
+      <w:lvlText w:val=""/>
+      <w:lvlJc w:val="left"/>
+      <w:pPr>
+        <w:ind w:left="5040" w:hanging="360"/>
+      </w:pPr>
+      <w:rPr>
+        <w:rFonts w:ascii="Symbol" w:hAnsi="Symbol" w:hint="default"/>
+      </w:rPr>
+    </w:lvl>
+    <w:lvl w:ilvl="7" w:tplc="08090003" w:tentative="1">
+      <w:start w:val="1"/>
+      <w:numFmt w:val="bullet"/>
+      <w:lvlText w:val="o"/>
+      <w:lvlJc w:val="left"/>
+      <w:pPr>
+        <w:ind w:left="5760" w:hanging="360"/>
+      </w:pPr>
+      <w:rPr>
+        <w:rFonts w:ascii="Courier New" w:hAnsi="Courier New" w:cs="Courier New" w:hint="default"/>
+      </w:rPr>
+    </w:lvl>
+    <w:lvl w:ilvl="8" w:tplc="08090005" w:tentative="1">
+      <w:start w:val="1"/>
+      <w:numFmt w:val="bullet"/>
+      <w:lvlText w:val=""/>
+      <w:lvlJc w:val="left"/>
+      <w:pPr>
+        <w:ind w:left="6480" w:hanging="360"/>
+      </w:pPr>
+      <w:rPr>
+        <w:rFonts w:ascii="Wingdings" w:hAnsi="Wingdings" w:hint="default"/>
+      </w:rPr>
+    </w:lvl>
+  </w:abstractNum>
+  <w:abstractNum w:abstractNumId="10" w15:restartNumberingAfterBreak="0">
     <w:nsid w:val="14D01211"/>
     <w:multiLevelType w:val="hybridMultilevel"/>
     <w:tmpl w:val="7B60A630"/>
@@ -14553,7 +15654,7 @@
       </w:rPr>
     </w:lvl>
   </w:abstractNum>
-  <w:abstractNum w:abstractNumId="10" w15:restartNumberingAfterBreak="0">
+  <w:abstractNum w:abstractNumId="11" w15:restartNumberingAfterBreak="0">
     <w:nsid w:val="14DA2317"/>
     <w:multiLevelType w:val="hybridMultilevel"/>
     <w:tmpl w:val="C566903E"/>
@@ -14666,7 +15767,7 @@
       </w:rPr>
     </w:lvl>
   </w:abstractNum>
-  <w:abstractNum w:abstractNumId="11" w15:restartNumberingAfterBreak="0">
+  <w:abstractNum w:abstractNumId="12" w15:restartNumberingAfterBreak="0">
     <w:nsid w:val="15464B67"/>
     <w:multiLevelType w:val="hybridMultilevel"/>
     <w:tmpl w:val="5E988318"/>
@@ -14779,10 +15880,10 @@
       </w:rPr>
     </w:lvl>
   </w:abstractNum>
-  <w:abstractNum w:abstractNumId="12" w15:restartNumberingAfterBreak="0">
+  <w:abstractNum w:abstractNumId="13" w15:restartNumberingAfterBreak="0">
     <w:nsid w:val="178572F4"/>
     <w:multiLevelType w:val="hybridMultilevel"/>
-    <w:tmpl w:val="8CD0A1BE"/>
+    <w:tmpl w:val="5E3EE2A2"/>
     <w:lvl w:ilvl="0" w:tplc="08090001">
       <w:start w:val="1"/>
       <w:numFmt w:val="bullet"/>
@@ -14795,7 +15896,7 @@
         <w:rFonts w:ascii="Symbol" w:hAnsi="Symbol" w:hint="default"/>
       </w:rPr>
     </w:lvl>
-    <w:lvl w:ilvl="1" w:tplc="08090003" w:tentative="1">
+    <w:lvl w:ilvl="1" w:tplc="08090003">
       <w:start w:val="1"/>
       <w:numFmt w:val="bullet"/>
       <w:lvlText w:val="o"/>
@@ -14892,7 +15993,7 @@
       </w:rPr>
     </w:lvl>
   </w:abstractNum>
-  <w:abstractNum w:abstractNumId="13" w15:restartNumberingAfterBreak="0">
+  <w:abstractNum w:abstractNumId="14" w15:restartNumberingAfterBreak="0">
     <w:nsid w:val="19741A0C"/>
     <w:multiLevelType w:val="hybridMultilevel"/>
     <w:tmpl w:val="93140C0E"/>
@@ -15005,7 +16106,7 @@
       </w:rPr>
     </w:lvl>
   </w:abstractNum>
-  <w:abstractNum w:abstractNumId="14" w15:restartNumberingAfterBreak="0">
+  <w:abstractNum w:abstractNumId="15" w15:restartNumberingAfterBreak="0">
     <w:nsid w:val="1C910FAB"/>
     <w:multiLevelType w:val="hybridMultilevel"/>
     <w:tmpl w:val="3A787050"/>
@@ -15118,7 +16219,7 @@
       </w:rPr>
     </w:lvl>
   </w:abstractNum>
-  <w:abstractNum w:abstractNumId="15" w15:restartNumberingAfterBreak="0">
+  <w:abstractNum w:abstractNumId="16" w15:restartNumberingAfterBreak="0">
     <w:nsid w:val="1D5C1890"/>
     <w:multiLevelType w:val="hybridMultilevel"/>
     <w:tmpl w:val="232A7296"/>
@@ -15231,7 +16332,7 @@
       </w:rPr>
     </w:lvl>
   </w:abstractNum>
-  <w:abstractNum w:abstractNumId="16" w15:restartNumberingAfterBreak="0">
+  <w:abstractNum w:abstractNumId="17" w15:restartNumberingAfterBreak="0">
     <w:nsid w:val="1F066B42"/>
     <w:multiLevelType w:val="multilevel"/>
     <w:tmpl w:val="FCB09450"/>
@@ -15380,7 +16481,7 @@
       </w:rPr>
     </w:lvl>
   </w:abstractNum>
-  <w:abstractNum w:abstractNumId="17" w15:restartNumberingAfterBreak="0">
+  <w:abstractNum w:abstractNumId="18" w15:restartNumberingAfterBreak="0">
     <w:nsid w:val="1F066F88"/>
     <w:multiLevelType w:val="hybridMultilevel"/>
     <w:tmpl w:val="0D4EC39A"/>
@@ -15493,7 +16594,7 @@
       </w:rPr>
     </w:lvl>
   </w:abstractNum>
-  <w:abstractNum w:abstractNumId="18" w15:restartNumberingAfterBreak="0">
+  <w:abstractNum w:abstractNumId="19" w15:restartNumberingAfterBreak="0">
     <w:nsid w:val="1FE00165"/>
     <w:multiLevelType w:val="multilevel"/>
     <w:tmpl w:val="61625FD4"/>
@@ -15642,7 +16743,7 @@
       </w:rPr>
     </w:lvl>
   </w:abstractNum>
-  <w:abstractNum w:abstractNumId="19" w15:restartNumberingAfterBreak="0">
+  <w:abstractNum w:abstractNumId="20" w15:restartNumberingAfterBreak="0">
     <w:nsid w:val="235824E5"/>
     <w:multiLevelType w:val="multilevel"/>
     <w:tmpl w:val="2EE45AA4"/>
@@ -15791,7 +16892,7 @@
       </w:rPr>
     </w:lvl>
   </w:abstractNum>
-  <w:abstractNum w:abstractNumId="20" w15:restartNumberingAfterBreak="0">
+  <w:abstractNum w:abstractNumId="21" w15:restartNumberingAfterBreak="0">
     <w:nsid w:val="27A529D0"/>
     <w:multiLevelType w:val="multilevel"/>
     <w:tmpl w:val="ABB6DB00"/>
@@ -15940,7 +17041,7 @@
       </w:rPr>
     </w:lvl>
   </w:abstractNum>
-  <w:abstractNum w:abstractNumId="21" w15:restartNumberingAfterBreak="0">
+  <w:abstractNum w:abstractNumId="22" w15:restartNumberingAfterBreak="0">
     <w:nsid w:val="2AEB27AC"/>
     <w:multiLevelType w:val="hybridMultilevel"/>
     <w:tmpl w:val="E9A604C6"/>
@@ -16026,7 +17127,7 @@
       </w:pPr>
     </w:lvl>
   </w:abstractNum>
-  <w:abstractNum w:abstractNumId="22" w15:restartNumberingAfterBreak="0">
+  <w:abstractNum w:abstractNumId="23" w15:restartNumberingAfterBreak="0">
     <w:nsid w:val="2C514CB2"/>
     <w:multiLevelType w:val="hybridMultilevel"/>
     <w:tmpl w:val="1F6242F2"/>
@@ -16139,7 +17240,7 @@
       </w:rPr>
     </w:lvl>
   </w:abstractNum>
-  <w:abstractNum w:abstractNumId="23" w15:restartNumberingAfterBreak="0">
+  <w:abstractNum w:abstractNumId="24" w15:restartNumberingAfterBreak="0">
     <w:nsid w:val="2D38009D"/>
     <w:multiLevelType w:val="hybridMultilevel"/>
     <w:tmpl w:val="99280E74"/>
@@ -16252,7 +17353,7 @@
       </w:rPr>
     </w:lvl>
   </w:abstractNum>
-  <w:abstractNum w:abstractNumId="24" w15:restartNumberingAfterBreak="0">
+  <w:abstractNum w:abstractNumId="25" w15:restartNumberingAfterBreak="0">
     <w:nsid w:val="2F9F2EA7"/>
     <w:multiLevelType w:val="hybridMultilevel"/>
     <w:tmpl w:val="B11AE5DA"/>
@@ -16365,7 +17466,7 @@
       </w:rPr>
     </w:lvl>
   </w:abstractNum>
-  <w:abstractNum w:abstractNumId="25" w15:restartNumberingAfterBreak="0">
+  <w:abstractNum w:abstractNumId="26" w15:restartNumberingAfterBreak="0">
     <w:nsid w:val="378D6023"/>
     <w:multiLevelType w:val="hybridMultilevel"/>
     <w:tmpl w:val="D2DCE7BE"/>
@@ -16478,7 +17579,7 @@
       </w:rPr>
     </w:lvl>
   </w:abstractNum>
-  <w:abstractNum w:abstractNumId="26" w15:restartNumberingAfterBreak="0">
+  <w:abstractNum w:abstractNumId="27" w15:restartNumberingAfterBreak="0">
     <w:nsid w:val="3DF93F66"/>
     <w:multiLevelType w:val="multilevel"/>
     <w:tmpl w:val="D8605EE8"/>
@@ -16627,7 +17728,120 @@
       </w:rPr>
     </w:lvl>
   </w:abstractNum>
-  <w:abstractNum w:abstractNumId="27" w15:restartNumberingAfterBreak="0">
+  <w:abstractNum w:abstractNumId="28" w15:restartNumberingAfterBreak="0">
+    <w:nsid w:val="3ECE263D"/>
+    <w:multiLevelType w:val="hybridMultilevel"/>
+    <w:tmpl w:val="33A0DB92"/>
+    <w:lvl w:ilvl="0" w:tplc="08090001">
+      <w:start w:val="1"/>
+      <w:numFmt w:val="bullet"/>
+      <w:lvlText w:val=""/>
+      <w:lvlJc w:val="left"/>
+      <w:pPr>
+        <w:ind w:left="720" w:hanging="360"/>
+      </w:pPr>
+      <w:rPr>
+        <w:rFonts w:ascii="Symbol" w:hAnsi="Symbol" w:hint="default"/>
+      </w:rPr>
+    </w:lvl>
+    <w:lvl w:ilvl="1" w:tplc="08090003" w:tentative="1">
+      <w:start w:val="1"/>
+      <w:numFmt w:val="bullet"/>
+      <w:lvlText w:val="o"/>
+      <w:lvlJc w:val="left"/>
+      <w:pPr>
+        <w:ind w:left="1440" w:hanging="360"/>
+      </w:pPr>
+      <w:rPr>
+        <w:rFonts w:ascii="Courier New" w:hAnsi="Courier New" w:cs="Courier New" w:hint="default"/>
+      </w:rPr>
+    </w:lvl>
+    <w:lvl w:ilvl="2" w:tplc="08090005" w:tentative="1">
+      <w:start w:val="1"/>
+      <w:numFmt w:val="bullet"/>
+      <w:lvlText w:val=""/>
+      <w:lvlJc w:val="left"/>
+      <w:pPr>
+        <w:ind w:left="2160" w:hanging="360"/>
+      </w:pPr>
+      <w:rPr>
+        <w:rFonts w:ascii="Wingdings" w:hAnsi="Wingdings" w:hint="default"/>
+      </w:rPr>
+    </w:lvl>
+    <w:lvl w:ilvl="3" w:tplc="08090001" w:tentative="1">
+      <w:start w:val="1"/>
+      <w:numFmt w:val="bullet"/>
+      <w:lvlText w:val=""/>
+      <w:lvlJc w:val="left"/>
+      <w:pPr>
+        <w:ind w:left="2880" w:hanging="360"/>
+      </w:pPr>
+      <w:rPr>
+        <w:rFonts w:ascii="Symbol" w:hAnsi="Symbol" w:hint="default"/>
+      </w:rPr>
+    </w:lvl>
+    <w:lvl w:ilvl="4" w:tplc="08090003" w:tentative="1">
+      <w:start w:val="1"/>
+      <w:numFmt w:val="bullet"/>
+      <w:lvlText w:val="o"/>
+      <w:lvlJc w:val="left"/>
+      <w:pPr>
+        <w:ind w:left="3600" w:hanging="360"/>
+      </w:pPr>
+      <w:rPr>
+        <w:rFonts w:ascii="Courier New" w:hAnsi="Courier New" w:cs="Courier New" w:hint="default"/>
+      </w:rPr>
+    </w:lvl>
+    <w:lvl w:ilvl="5" w:tplc="08090005" w:tentative="1">
+      <w:start w:val="1"/>
+      <w:numFmt w:val="bullet"/>
+      <w:lvlText w:val=""/>
+      <w:lvlJc w:val="left"/>
+      <w:pPr>
+        <w:ind w:left="4320" w:hanging="360"/>
+      </w:pPr>
+      <w:rPr>
+        <w:rFonts w:ascii="Wingdings" w:hAnsi="Wingdings" w:hint="default"/>
+      </w:rPr>
+    </w:lvl>
+    <w:lvl w:ilvl="6" w:tplc="08090001" w:tentative="1">
+      <w:start w:val="1"/>
+      <w:numFmt w:val="bullet"/>
+      <w:lvlText w:val=""/>
+      <w:lvlJc w:val="left"/>
+      <w:pPr>
+        <w:ind w:left="5040" w:hanging="360"/>
+      </w:pPr>
+      <w:rPr>
+        <w:rFonts w:ascii="Symbol" w:hAnsi="Symbol" w:hint="default"/>
+      </w:rPr>
+    </w:lvl>
+    <w:lvl w:ilvl="7" w:tplc="08090003" w:tentative="1">
+      <w:start w:val="1"/>
+      <w:numFmt w:val="bullet"/>
+      <w:lvlText w:val="o"/>
+      <w:lvlJc w:val="left"/>
+      <w:pPr>
+        <w:ind w:left="5760" w:hanging="360"/>
+      </w:pPr>
+      <w:rPr>
+        <w:rFonts w:ascii="Courier New" w:hAnsi="Courier New" w:cs="Courier New" w:hint="default"/>
+      </w:rPr>
+    </w:lvl>
+    <w:lvl w:ilvl="8" w:tplc="08090005" w:tentative="1">
+      <w:start w:val="1"/>
+      <w:numFmt w:val="bullet"/>
+      <w:lvlText w:val=""/>
+      <w:lvlJc w:val="left"/>
+      <w:pPr>
+        <w:ind w:left="6480" w:hanging="360"/>
+      </w:pPr>
+      <w:rPr>
+        <w:rFonts w:ascii="Wingdings" w:hAnsi="Wingdings" w:hint="default"/>
+      </w:rPr>
+    </w:lvl>
+  </w:abstractNum>
+  <w:abstractNum w:abstractNumId="29" w15:restartNumberingAfterBreak="0">
     <w:nsid w:val="40C45632"/>
     <w:multiLevelType w:val="hybridMultilevel"/>
     <w:tmpl w:val="21FC2B42"/>
@@ -16740,7 +17954,7 @@
       </w:rPr>
     </w:lvl>
   </w:abstractNum>
-  <w:abstractNum w:abstractNumId="28" w15:restartNumberingAfterBreak="0">
+  <w:abstractNum w:abstractNumId="30" w15:restartNumberingAfterBreak="0">
     <w:nsid w:val="44175C91"/>
     <w:multiLevelType w:val="hybridMultilevel"/>
     <w:tmpl w:val="C094A1DA"/>
@@ -16853,7 +18067,7 @@
       </w:rPr>
     </w:lvl>
   </w:abstractNum>
-  <w:abstractNum w:abstractNumId="29" w15:restartNumberingAfterBreak="0">
+  <w:abstractNum w:abstractNumId="31" w15:restartNumberingAfterBreak="0">
     <w:nsid w:val="44AC30ED"/>
     <w:multiLevelType w:val="hybridMultilevel"/>
     <w:tmpl w:val="271CCD68"/>
@@ -16966,7 +18180,7 @@
       </w:rPr>
     </w:lvl>
   </w:abstractNum>
-  <w:abstractNum w:abstractNumId="30" w15:restartNumberingAfterBreak="0">
+  <w:abstractNum w:abstractNumId="32" w15:restartNumberingAfterBreak="0">
     <w:nsid w:val="47776E16"/>
     <w:multiLevelType w:val="hybridMultilevel"/>
     <w:tmpl w:val="2B302EB2"/>
@@ -17079,7 +18293,156 @@
       </w:rPr>
     </w:lvl>
   </w:abstractNum>
-  <w:abstractNum w:abstractNumId="31" w15:restartNumberingAfterBreak="0">
+  <w:abstractNum w:abstractNumId="33" w15:restartNumberingAfterBreak="0">
+    <w:nsid w:val="483C5EE0"/>
+    <w:multiLevelType w:val="multilevel"/>
+    <w:tmpl w:val="E74A8606"/>
+    <w:lvl w:ilvl="0">
+      <w:start w:val="1"/>
+      <w:numFmt w:val="bullet"/>
+      <w:lvlText w:val=""/>
+      <w:lvlJc w:val="left"/>
+      <w:pPr>
+        <w:tabs>
+          <w:tab w:val="num" w:pos="720"/>
+        </w:tabs>
+        <w:ind w:left="720" w:hanging="360"/>
+      </w:pPr>
+      <w:rPr>
+        <w:rFonts w:ascii="Symbol" w:hAnsi="Symbol" w:hint="default"/>
+        <w:sz w:val="20"/>
+      </w:rPr>
+    </w:lvl>
+    <w:lvl w:ilvl="1" w:tentative="1">
+      <w:start w:val="1"/>
+      <w:numFmt w:val="bullet"/>
+      <w:lvlText w:val="o"/>
+      <w:lvlJc w:val="left"/>
+      <w:pPr>
+        <w:tabs>
+          <w:tab w:val="num" w:pos="1440"/>
+        </w:tabs>
+        <w:ind w:left="1440" w:hanging="360"/>
+      </w:pPr>
+      <w:rPr>
+        <w:rFonts w:ascii="Courier New" w:hAnsi="Courier New" w:hint="default"/>
+        <w:sz w:val="20"/>
+      </w:rPr>
+    </w:lvl>
+    <w:lvl w:ilvl="2" w:tentative="1">
+      <w:start w:val="1"/>
+      <w:numFmt w:val="bullet"/>
+      <w:lvlText w:val=""/>
+      <w:lvlJc w:val="left"/>
+      <w:pPr>
+        <w:tabs>
+          <w:tab w:val="num" w:pos="2160"/>
+        </w:tabs>
+        <w:ind w:left="2160" w:hanging="360"/>
+      </w:pPr>
+      <w:rPr>
+        <w:rFonts w:ascii="Wingdings" w:hAnsi="Wingdings" w:hint="default"/>
+        <w:sz w:val="20"/>
+      </w:rPr>
+    </w:lvl>
+    <w:lvl w:ilvl="3" w:tentative="1">
+      <w:start w:val="1"/>
+      <w:numFmt w:val="bullet"/>
+      <w:lvlText w:val=""/>
+      <w:lvlJc w:val="left"/>
+      <w:pPr>
+        <w:tabs>
+          <w:tab w:val="num" w:pos="2880"/>
+        </w:tabs>
+        <w:ind w:left="2880" w:hanging="360"/>
+      </w:pPr>
+      <w:rPr>
+        <w:rFonts w:ascii="Wingdings" w:hAnsi="Wingdings" w:hint="default"/>
+        <w:sz w:val="20"/>
+      </w:rPr>
+    </w:lvl>
+    <w:lvl w:ilvl="4" w:tentative="1">
+      <w:start w:val="1"/>
+      <w:numFmt w:val="bullet"/>
+      <w:lvlText w:val=""/>
+      <w:lvlJc w:val="left"/>
+      <w:pPr>
+        <w:tabs>
+          <w:tab w:val="num" w:pos="3600"/>
+        </w:tabs>
+        <w:ind w:left="3600" w:hanging="360"/>
+      </w:pPr>
+      <w:rPr>
+        <w:rFonts w:ascii="Wingdings" w:hAnsi="Wingdings" w:hint="default"/>
+        <w:sz w:val="20"/>
+      </w:rPr>
+    </w:lvl>
+    <w:lvl w:ilvl="5" w:tentative="1">
+      <w:start w:val="1"/>
+      <w:numFmt w:val="bullet"/>
+      <w:lvlText w:val=""/>
+      <w:lvlJc w:val="left"/>
+      <w:pPr>
+        <w:tabs>
+          <w:tab w:val="num" w:pos="4320"/>
+        </w:tabs>
+        <w:ind w:left="4320" w:hanging="360"/>
+      </w:pPr>
+      <w:rPr>
+        <w:rFonts w:ascii="Wingdings" w:hAnsi="Wingdings" w:hint="default"/>
+        <w:sz w:val="20"/>
+      </w:rPr>
+    </w:lvl>
+    <w:lvl w:ilvl="6" w:tentative="1">
+      <w:start w:val="1"/>
+      <w:numFmt w:val="bullet"/>
+      <w:lvlText w:val=""/>
+      <w:lvlJc w:val="left"/>
+      <w:pPr>
+        <w:tabs>
+          <w:tab w:val="num" w:pos="5040"/>
+        </w:tabs>
+        <w:ind w:left="5040" w:hanging="360"/>
+      </w:pPr>
+      <w:rPr>
+        <w:rFonts w:ascii="Wingdings" w:hAnsi="Wingdings" w:hint="default"/>
+        <w:sz w:val="20"/>
+      </w:rPr>
+    </w:lvl>
+    <w:lvl w:ilvl="7" w:tentative="1">
+      <w:start w:val="1"/>
+      <w:numFmt w:val="bullet"/>
+      <w:lvlText w:val=""/>
+      <w:lvlJc w:val="left"/>
+      <w:pPr>
+        <w:tabs>
+          <w:tab w:val="num" w:pos="5760"/>
+        </w:tabs>
+        <w:ind w:left="5760" w:hanging="360"/>
+      </w:pPr>
+      <w:rPr>
+        <w:rFonts w:ascii="Wingdings" w:hAnsi="Wingdings" w:hint="default"/>
+        <w:sz w:val="20"/>
+      </w:rPr>
+    </w:lvl>
+    <w:lvl w:ilvl="8" w:tentative="1">
+      <w:start w:val="1"/>
+      <w:numFmt w:val="bullet"/>
+      <w:lvlText w:val=""/>
+      <w:lvlJc w:val="left"/>
+      <w:pPr>
+        <w:tabs>
+          <w:tab w:val="num" w:pos="6480"/>
+        </w:tabs>
+        <w:ind w:left="6480" w:hanging="360"/>
+      </w:pPr>
+      <w:rPr>
+        <w:rFonts w:ascii="Wingdings" w:hAnsi="Wingdings" w:hint="default"/>
+        <w:sz w:val="20"/>
+      </w:rPr>
+    </w:lvl>
+  </w:abstractNum>
+  <w:abstractNum w:abstractNumId="34" w15:restartNumberingAfterBreak="0">
     <w:nsid w:val="4B181F16"/>
     <w:multiLevelType w:val="hybridMultilevel"/>
     <w:tmpl w:val="794497D4"/>
@@ -17192,7 +18555,7 @@
       </w:rPr>
     </w:lvl>
   </w:abstractNum>
-  <w:abstractNum w:abstractNumId="32" w15:restartNumberingAfterBreak="0">
+  <w:abstractNum w:abstractNumId="35" w15:restartNumberingAfterBreak="0">
     <w:nsid w:val="4CEB19FB"/>
     <w:multiLevelType w:val="multilevel"/>
     <w:tmpl w:val="B096E6E6"/>
@@ -17341,7 +18704,7 @@
       </w:rPr>
     </w:lvl>
   </w:abstractNum>
-  <w:abstractNum w:abstractNumId="33" w15:restartNumberingAfterBreak="0">
+  <w:abstractNum w:abstractNumId="36" w15:restartNumberingAfterBreak="0">
     <w:nsid w:val="4F2919EF"/>
     <w:multiLevelType w:val="hybridMultilevel"/>
     <w:tmpl w:val="2D36E7FE"/>
@@ -17454,7 +18817,7 @@
       </w:rPr>
     </w:lvl>
   </w:abstractNum>
-  <w:abstractNum w:abstractNumId="34" w15:restartNumberingAfterBreak="0">
+  <w:abstractNum w:abstractNumId="37" w15:restartNumberingAfterBreak="0">
     <w:nsid w:val="5828341C"/>
     <w:multiLevelType w:val="multilevel"/>
     <w:tmpl w:val="852ED5F8"/>
@@ -17567,7 +18930,7 @@
       </w:rPr>
     </w:lvl>
   </w:abstractNum>
-  <w:abstractNum w:abstractNumId="35" w15:restartNumberingAfterBreak="0">
+  <w:abstractNum w:abstractNumId="38" w15:restartNumberingAfterBreak="0">
     <w:nsid w:val="58D24327"/>
     <w:multiLevelType w:val="hybridMultilevel"/>
     <w:tmpl w:val="C36ED86E"/>
@@ -17680,7 +19043,7 @@
       </w:rPr>
     </w:lvl>
   </w:abstractNum>
-  <w:abstractNum w:abstractNumId="36" w15:restartNumberingAfterBreak="0">
+  <w:abstractNum w:abstractNumId="39" w15:restartNumberingAfterBreak="0">
     <w:nsid w:val="5BF3394E"/>
     <w:multiLevelType w:val="hybridMultilevel"/>
     <w:tmpl w:val="4E742098"/>
@@ -17793,7 +19156,7 @@
       </w:rPr>
     </w:lvl>
   </w:abstractNum>
-  <w:abstractNum w:abstractNumId="37" w15:restartNumberingAfterBreak="0">
+  <w:abstractNum w:abstractNumId="40" w15:restartNumberingAfterBreak="0">
     <w:nsid w:val="613508E6"/>
     <w:multiLevelType w:val="hybridMultilevel"/>
     <w:tmpl w:val="42868B58"/>
@@ -17906,7 +19269,7 @@
       </w:rPr>
     </w:lvl>
   </w:abstractNum>
-  <w:abstractNum w:abstractNumId="38" w15:restartNumberingAfterBreak="0">
+  <w:abstractNum w:abstractNumId="41" w15:restartNumberingAfterBreak="0">
     <w:nsid w:val="62A77B7E"/>
     <w:multiLevelType w:val="hybridMultilevel"/>
     <w:tmpl w:val="B2C23C82"/>
@@ -18019,7 +19382,7 @@
       </w:rPr>
     </w:lvl>
   </w:abstractNum>
-  <w:abstractNum w:abstractNumId="39" w15:restartNumberingAfterBreak="0">
+  <w:abstractNum w:abstractNumId="42" w15:restartNumberingAfterBreak="0">
     <w:nsid w:val="6F597C16"/>
     <w:multiLevelType w:val="hybridMultilevel"/>
     <w:tmpl w:val="3330497A"/>
@@ -18132,7 +19495,7 @@
       </w:rPr>
     </w:lvl>
   </w:abstractNum>
-  <w:abstractNum w:abstractNumId="40" w15:restartNumberingAfterBreak="0">
+  <w:abstractNum w:abstractNumId="43" w15:restartNumberingAfterBreak="0">
     <w:nsid w:val="713723C3"/>
     <w:multiLevelType w:val="hybridMultilevel"/>
     <w:tmpl w:val="49489C50"/>
@@ -18218,7 +19581,7 @@
       </w:pPr>
     </w:lvl>
   </w:abstractNum>
-  <w:abstractNum w:abstractNumId="41" w15:restartNumberingAfterBreak="0">
+  <w:abstractNum w:abstractNumId="44" w15:restartNumberingAfterBreak="0">
     <w:nsid w:val="73443D2E"/>
     <w:multiLevelType w:val="multilevel"/>
     <w:tmpl w:val="A33E0D1E"/>
@@ -18367,7 +19730,7 @@
       </w:rPr>
     </w:lvl>
   </w:abstractNum>
-  <w:abstractNum w:abstractNumId="42" w15:restartNumberingAfterBreak="0">
+  <w:abstractNum w:abstractNumId="45" w15:restartNumberingAfterBreak="0">
     <w:nsid w:val="76060948"/>
     <w:multiLevelType w:val="hybridMultilevel"/>
     <w:tmpl w:val="848EA6AA"/>
@@ -18480,7 +19843,7 @@
       </w:rPr>
     </w:lvl>
   </w:abstractNum>
-  <w:abstractNum w:abstractNumId="43" w15:restartNumberingAfterBreak="0">
+  <w:abstractNum w:abstractNumId="46" w15:restartNumberingAfterBreak="0">
     <w:nsid w:val="77194D12"/>
     <w:multiLevelType w:val="hybridMultilevel"/>
     <w:tmpl w:val="02BC2356"/>
@@ -18593,7 +19956,7 @@
       </w:rPr>
     </w:lvl>
   </w:abstractNum>
-  <w:abstractNum w:abstractNumId="44" w15:restartNumberingAfterBreak="0">
+  <w:abstractNum w:abstractNumId="47" w15:restartNumberingAfterBreak="0">
     <w:nsid w:val="7C9B094D"/>
     <w:multiLevelType w:val="hybridMultilevel"/>
     <w:tmpl w:val="44C23912"/>
@@ -18734,19 +20097,19 @@
     </w:lvl>
   </w:abstractNum>
   <w:num w:numId="1" w16cid:durableId="262035689">
-    <w:abstractNumId w:val="29"/>
+    <w:abstractNumId w:val="31"/>
   </w:num>
   <w:num w:numId="2" w16cid:durableId="982124795">
-    <w:abstractNumId w:val="44"/>
+    <w:abstractNumId w:val="47"/>
   </w:num>
   <w:num w:numId="3" w16cid:durableId="807014320">
-    <w:abstractNumId w:val="40"/>
+    <w:abstractNumId w:val="43"/>
   </w:num>
   <w:num w:numId="4" w16cid:durableId="1050300190">
-    <w:abstractNumId w:val="34"/>
+    <w:abstractNumId w:val="37"/>
   </w:num>
   <w:num w:numId="5" w16cid:durableId="1323007279">
-    <w:abstractNumId w:val="36"/>
+    <w:abstractNumId w:val="39"/>
   </w:num>
   <w:num w:numId="6" w16cid:durableId="1008367305">
     <w:abstractNumId w:val="7"/>
@@ -18755,118 +20118,127 @@
     <w:abstractNumId w:val="4"/>
   </w:num>
   <w:num w:numId="8" w16cid:durableId="501969995">
-    <w:abstractNumId w:val="19"/>
+    <w:abstractNumId w:val="20"/>
   </w:num>
   <w:num w:numId="9" w16cid:durableId="1721055962">
     <w:abstractNumId w:val="1"/>
   </w:num>
   <w:num w:numId="10" w16cid:durableId="433669215">
-    <w:abstractNumId w:val="16"/>
+    <w:abstractNumId w:val="17"/>
   </w:num>
   <w:num w:numId="11" w16cid:durableId="1906910810">
-    <w:abstractNumId w:val="32"/>
+    <w:abstractNumId w:val="35"/>
   </w:num>
   <w:num w:numId="12" w16cid:durableId="1953785115">
     <w:abstractNumId w:val="0"/>
   </w:num>
   <w:num w:numId="13" w16cid:durableId="180819336">
-    <w:abstractNumId w:val="41"/>
+    <w:abstractNumId w:val="44"/>
   </w:num>
   <w:num w:numId="14" w16cid:durableId="1801849104">
-    <w:abstractNumId w:val="20"/>
+    <w:abstractNumId w:val="21"/>
   </w:num>
   <w:num w:numId="15" w16cid:durableId="1506170565">
-    <w:abstractNumId w:val="18"/>
+    <w:abstractNumId w:val="19"/>
   </w:num>
   <w:num w:numId="16" w16cid:durableId="1497457616">
     <w:abstractNumId w:val="3"/>
   </w:num>
   <w:num w:numId="17" w16cid:durableId="662011106">
-    <w:abstractNumId w:val="33"/>
+    <w:abstractNumId w:val="36"/>
   </w:num>
   <w:num w:numId="18" w16cid:durableId="599338685">
-    <w:abstractNumId w:val="35"/>
+    <w:abstractNumId w:val="38"/>
   </w:num>
   <w:num w:numId="19" w16cid:durableId="54666278">
-    <w:abstractNumId w:val="27"/>
+    <w:abstractNumId w:val="29"/>
   </w:num>
   <w:num w:numId="20" w16cid:durableId="95946252">
-    <w:abstractNumId w:val="39"/>
+    <w:abstractNumId w:val="42"/>
   </w:num>
   <w:num w:numId="21" w16cid:durableId="409233616">
-    <w:abstractNumId w:val="10"/>
+    <w:abstractNumId w:val="11"/>
   </w:num>
   <w:num w:numId="22" w16cid:durableId="1022973101">
-    <w:abstractNumId w:val="17"/>
+    <w:abstractNumId w:val="18"/>
   </w:num>
   <w:num w:numId="23" w16cid:durableId="697892956">
     <w:abstractNumId w:val="2"/>
   </w:num>
   <w:num w:numId="24" w16cid:durableId="1331327774">
-    <w:abstractNumId w:val="9"/>
+    <w:abstractNumId w:val="10"/>
   </w:num>
   <w:num w:numId="25" w16cid:durableId="1538153279">
-    <w:abstractNumId w:val="22"/>
+    <w:abstractNumId w:val="23"/>
   </w:num>
   <w:num w:numId="26" w16cid:durableId="1634600804">
-    <w:abstractNumId w:val="11"/>
+    <w:abstractNumId w:val="12"/>
   </w:num>
   <w:num w:numId="27" w16cid:durableId="581184234">
-    <w:abstractNumId w:val="14"/>
+    <w:abstractNumId w:val="15"/>
   </w:num>
   <w:num w:numId="28" w16cid:durableId="673849345">
     <w:abstractNumId w:val="8"/>
   </w:num>
   <w:num w:numId="29" w16cid:durableId="1801146875">
-    <w:abstractNumId w:val="21"/>
+    <w:abstractNumId w:val="22"/>
   </w:num>
   <w:num w:numId="30" w16cid:durableId="685592222">
-    <w:abstractNumId w:val="13"/>
+    <w:abstractNumId w:val="14"/>
   </w:num>
   <w:num w:numId="31" w16cid:durableId="75254566">
-    <w:abstractNumId w:val="42"/>
+    <w:abstractNumId w:val="45"/>
   </w:num>
   <w:num w:numId="32" w16cid:durableId="122700522">
-    <w:abstractNumId w:val="23"/>
+    <w:abstractNumId w:val="24"/>
   </w:num>
   <w:num w:numId="33" w16cid:durableId="447705926">
-    <w:abstractNumId w:val="15"/>
+    <w:abstractNumId w:val="16"/>
   </w:num>
   <w:num w:numId="34" w16cid:durableId="684983511">
-    <w:abstractNumId w:val="38"/>
+    <w:abstractNumId w:val="41"/>
   </w:num>
   <w:num w:numId="35" w16cid:durableId="704796887">
-    <w:abstractNumId w:val="31"/>
+    <w:abstractNumId w:val="34"/>
   </w:num>
   <w:num w:numId="36" w16cid:durableId="1969700595">
     <w:abstractNumId w:val="6"/>
   </w:num>
   <w:num w:numId="37" w16cid:durableId="1930576395">
-    <w:abstractNumId w:val="28"/>
+    <w:abstractNumId w:val="30"/>
   </w:num>
   <w:num w:numId="38" w16cid:durableId="729964821">
     <w:abstractNumId w:val="5"/>
   </w:num>
   <w:num w:numId="39" w16cid:durableId="1289970757">
-    <w:abstractNumId w:val="24"/>
+    <w:abstractNumId w:val="25"/>
   </w:num>
   <w:num w:numId="40" w16cid:durableId="1042943778">
-    <w:abstractNumId w:val="25"/>
+    <w:abstractNumId w:val="26"/>
   </w:num>
   <w:num w:numId="41" w16cid:durableId="1805732381">
-    <w:abstractNumId w:val="43"/>
+    <w:abstractNumId w:val="46"/>
   </w:num>
   <w:num w:numId="42" w16cid:durableId="2079161664">
-    <w:abstractNumId w:val="30"/>
+    <w:abstractNumId w:val="32"/>
   </w:num>
   <w:num w:numId="43" w16cid:durableId="986711150">
-    <w:abstractNumId w:val="26"/>
+    <w:abstractNumId w:val="27"/>
   </w:num>
   <w:num w:numId="44" w16cid:durableId="139272042">
-    <w:abstractNumId w:val="37"/>
+    <w:abstractNumId w:val="40"/>
   </w:num>
   <w:num w:numId="45" w16cid:durableId="147014300">
-    <w:abstractNumId w:val="12"/>
+    <w:abstractNumId w:val="13"/>
+  </w:num>
+  <w:num w:numId="46" w16cid:durableId="1320116154">
+    <w:abstractNumId w:val="28"/>
+  </w:num>
+  <w:num w:numId="47" w16cid:durableId="27610702">
+    <w:abstractNumId w:val="33"/>
+  </w:num>
+  <w:num w:numId="48" w16cid:durableId="1968849881">
+    <w:abstractNumId w:val="9"/>
   </w:num>
 </w:numbering>
 </file>
@@ -19396,7 +20768,6 @@
     <w:next w:val="Normal"/>
     <w:link w:val="Heading6Char"/>
     <w:uiPriority w:val="9"/>
-    <w:semiHidden/>
     <w:unhideWhenUsed/>
     <w:qFormat/>
     <w:rsid w:val="00477DC1"/>
@@ -19486,6 +20857,7 @@
   <w:style w:type="character" w:default="1" w:styleId="DefaultParagraphFont">
     <w:name w:val="Default Paragraph Font"/>
     <w:uiPriority w:val="1"/>
+    <w:semiHidden/>
     <w:unhideWhenUsed/>
   </w:style>
   <w:style w:type="table" w:default="1" w:styleId="TableNormal">
@@ -19947,7 +21319,6 @@
     <w:basedOn w:val="DefaultParagraphFont"/>
     <w:link w:val="Heading6"/>
     <w:uiPriority w:val="9"/>
-    <w:semiHidden/>
     <w:rsid w:val="00477DC1"/>
     <w:rPr>
       <w:rFonts w:ascii="Century Gothic" w:eastAsiaTheme="majorEastAsia" w:hAnsi="Century Gothic" w:cstheme="majorBidi"/>

</xml_diff>